<commit_message>
More comments to Susannes error reports
</commit_message>
<xml_diff>
--- a/Documentation/TEst reports/3.3/Test Ibos nodelæser 3 3 kommentarer Susanne.docx
+++ b/Documentation/TEst reports/3.3/Test Ibos nodelæser 3 3 kommentarer Susanne.docx
@@ -299,168 +299,251 @@
     <w:p>
       <w:pPr>
         <w:pStyle w:val="Normal"/>
+        <w:rPr/>
+      </w:pPr>
+      <w:r>
         <w:rPr>
           <w:color w:val="FF0000"/>
         </w:rPr>
-      </w:pPr>
-      <w:r>
+        <w:t>JSJ: Det er ”as designed” at der kun vises en node per slag i  ”IBOS Nodelæser” opstilling. Og når der så kun er en node per slag bliver det jo til et node per linle. Det er til gengæld superlet at navigere i musikken og ekstra linjer koster jo ikke papir.</w:t>
+      </w:r>
+    </w:p>
+    <w:p>
+      <w:pPr>
+        <w:pStyle w:val="Normal"/>
         <w:rPr>
           <w:color w:val="FF0000"/>
         </w:rPr>
-        <w:t>JSJ: Det er ”as designed” at der kun vises en node per slag i  ”IBOS Nodelæser” opstilling. Og når der så kun er en node per slag bliver det jo til et node per linle. Det er til gengæld superlet at navigere i musikken og ekstra linjer koster jo ikke papir. Sluttegnet er 123,126,13. Jeg checker lige hvad det burde være.</w:t>
-      </w:r>
-    </w:p>
-    <w:p>
-      <w:pPr>
-        <w:pStyle w:val="Normal"/>
-        <w:rPr/>
-      </w:pPr>
-      <w:r>
-        <w:rPr/>
-      </w:r>
-    </w:p>
-    <w:p>
-      <w:pPr>
-        <w:pStyle w:val="Normal"/>
-        <w:rPr/>
-      </w:pPr>
-      <w:r>
-        <w:rPr/>
-      </w:r>
-    </w:p>
-    <w:p>
-      <w:pPr>
-        <w:pStyle w:val="Overskrift2"/>
-        <w:rPr/>
-      </w:pPr>
-      <w:r>
-        <w:rPr/>
-        <w:t xml:space="preserve">Maria gennem torne går Test 3 </w:t>
-      </w:r>
-    </w:p>
-    <w:p>
-      <w:pPr>
-        <w:pStyle w:val="Normal"/>
-        <w:rPr/>
-      </w:pPr>
-      <w:r>
-        <w:rPr/>
-        <w:t xml:space="preserve">Taget fra eksempelsamlingen i nodelæseren under julemusik </w:t>
-      </w:r>
-    </w:p>
-    <w:p>
-      <w:pPr>
-        <w:pStyle w:val="Normal"/>
-        <w:rPr/>
-      </w:pPr>
-      <w:r>
-        <w:rPr/>
-        <w:t xml:space="preserve">Visning af bistemmer og intervaller på punktnotatapparat u2mini </w:t>
-      </w:r>
-    </w:p>
-    <w:p>
-      <w:pPr>
-        <w:pStyle w:val="Normal"/>
-        <w:rPr/>
-      </w:pPr>
-      <w:r>
-        <w:rPr/>
-        <w:t xml:space="preserve">Punktnotatprofil indstillet til: </w:t>
-      </w:r>
-    </w:p>
-    <w:p>
-      <w:pPr>
-        <w:pStyle w:val="ListParagraph"/>
-        <w:numPr>
-          <w:ilvl w:val="0"/>
-          <w:numId w:val="1"/>
-        </w:numPr>
-        <w:rPr/>
-      </w:pPr>
-      <w:r>
-        <w:rPr/>
-        <w:t xml:space="preserve">Braille format .txt (OctoBraille 1252) </w:t>
-      </w:r>
-    </w:p>
-    <w:p>
-      <w:pPr>
-        <w:pStyle w:val="ListParagraph"/>
-        <w:numPr>
-          <w:ilvl w:val="0"/>
-          <w:numId w:val="1"/>
-        </w:numPr>
-        <w:rPr/>
-      </w:pPr>
-      <w:r>
-        <w:rPr/>
-        <w:t xml:space="preserve">Braille side opstilling Bana 2015 </w:t>
-      </w:r>
-    </w:p>
-    <w:p>
-      <w:pPr>
-        <w:pStyle w:val="ListParagraph"/>
-        <w:numPr>
-          <w:ilvl w:val="0"/>
-          <w:numId w:val="1"/>
-        </w:numPr>
-        <w:rPr/>
-      </w:pPr>
-      <w:r>
-        <w:rPr/>
-        <w:t xml:space="preserve">Braille sidebredde 32 </w:t>
-      </w:r>
-    </w:p>
-    <w:p>
-      <w:pPr>
-        <w:pStyle w:val="ListParagraph"/>
-        <w:numPr>
-          <w:ilvl w:val="0"/>
-          <w:numId w:val="1"/>
-        </w:numPr>
-        <w:rPr/>
-      </w:pPr>
-      <w:r>
-        <w:rPr/>
-        <w:t xml:space="preserve">Notatapparatnavn U2 Mini og polaris </w:t>
-      </w:r>
-    </w:p>
-    <w:p>
-      <w:pPr>
-        <w:pStyle w:val="Normal"/>
-        <w:rPr/>
-      </w:pPr>
-      <w:r>
-        <w:rPr/>
-      </w:r>
-    </w:p>
-    <w:p>
-      <w:pPr>
-        <w:pStyle w:val="Normal"/>
-        <w:rPr/>
-      </w:pPr>
-      <w:r>
-        <w:rPr/>
-        <w:t xml:space="preserve">Dette ligner langt mere noder end test 1. Men der er noget med læseretning i forhold til bistemmer, starter læseretningen fra bassen og opad og gælder dette hele stykket i gennem? Der er også noget med lille bistemmetegn kontra stor bistemmetegn. Efter skilletegn ved lille bistemmetegn skal altid bruges oktavtegn til den node, som kommer lige efter skilletegnet gældende for begge stemmer. Lille bistemme har traditionelt været anvendt, hvor stemmerne i kun en del af samme takt er så rytmisk forskellige, at de ikke kan noteres med intervaltegn. Store bistemmer har været andventd, hvor stemmerne inden for den pågældende takt har været så rytmisk forskellige, at intervaltegn ikke har kunnet anvendes i nogen del af takten. For store bistemmer gælder, at der skal oktavtegn. Jeg ved ikke, om de amerikanske regler mht. bistemmer ligner de regler, som har været andvendt i den danske brailleske nodeskrift grundbog 1 fra enten 1976 eller 1978, som jeg har en udgave af stående på punkt. Desværre har jeg heller ikke noget isbn. Nr. på denne punktbog. Lille bistemme består af pkt 5 og i næste skriverum pkt 2. Skilletegn kun anvendt sammen med lillebistemme består af pkt 46 og i næsteskriverum pkt 13. Stor bistemme består af pkt 126 og i næste skriverum pkt 345. </w:t>
-      </w:r>
-    </w:p>
-    <w:p>
-      <w:pPr>
-        <w:pStyle w:val="Normal"/>
+      </w:pPr>
+      <w:r>
+        <w:rPr/>
+      </w:r>
+      <w:r>
+        <w:br w:type="page"/>
+      </w:r>
+    </w:p>
+    <w:p>
+      <w:pPr>
+        <w:pStyle w:val="Normal"/>
+        <w:rPr/>
+      </w:pPr>
+      <w:r>
         <w:rPr>
           <w:color w:val="FF0000"/>
         </w:rPr>
-      </w:pPr>
+        <w:t xml:space="preserve">Sluttegnet er  </w:t>
+      </w:r>
       <w:r>
         <w:rPr>
           <w:color w:val="FF0000"/>
         </w:rPr>
-        <w:t xml:space="preserve">JSJ: Så vi må antage at U2 Mini og Polaris skal fodres med Octobraille 1252 og ikke spiser ASCII. Læseretningen forventes at være (Oppefra og ned for SA) (Nedefra og op for BT) (??? for TUTTI og SATB) . </w:t>
+        <w:t xml:space="preserve">nu </w:t>
       </w:r>
       <w:r>
         <w:rPr>
           <w:color w:val="FF0000"/>
         </w:rPr>
-        <w:t>Læseretningen forventes at være den samme hele filen igennem.</w:t>
+        <w:t xml:space="preserve">123,126,13. </w:t>
+      </w:r>
+      <w:r>
+        <w:rPr>
+          <w:color w:val="FF0000"/>
+        </w:rPr>
+        <w:t xml:space="preserve">I følge Refsnæs er det korrekte </w:t>
+      </w:r>
+    </w:p>
+    <w:p>
+      <w:pPr>
+        <w:pStyle w:val="Normal"/>
+        <w:rPr/>
+      </w:pPr>
+      <w:r>
+        <w:rPr>
+          <w:color w:val="FF0000"/>
+        </w:rPr>
+        <w:t>Helslutning : 6,3,126,13</w:t>
+      </w:r>
+    </w:p>
+    <w:p>
+      <w:pPr>
+        <w:pStyle w:val="Normal"/>
+        <w:rPr/>
+      </w:pPr>
+      <w:r>
+        <w:rPr>
+          <w:color w:val="FF0000"/>
+        </w:rPr>
+        <w:t>Halvslutning: 6,3,126,13,3</w:t>
+      </w:r>
+    </w:p>
+    <w:p>
+      <w:pPr>
+        <w:pStyle w:val="Normal"/>
+        <w:rPr/>
+      </w:pPr>
+      <w:r>
+        <w:rPr>
+          <w:color w:val="FF0000"/>
+        </w:rPr>
+        <w:t>Det er nu rettet. Foran sluttegnet genereres 123 som betyder ”Unusual bar”. Dette antages indtil videre at være korrekt, men muligvis overflødigt ?</w:t>
+      </w:r>
+    </w:p>
+    <w:p>
+      <w:pPr>
+        <w:pStyle w:val="Normal"/>
+        <w:rPr>
+          <w:color w:val="FF0000"/>
+        </w:rPr>
+      </w:pPr>
+      <w:r>
+        <w:rPr/>
+      </w:r>
+    </w:p>
+    <w:p>
+      <w:pPr>
+        <w:pStyle w:val="Normal"/>
+        <w:rPr/>
+      </w:pPr>
+      <w:r>
+        <w:rPr/>
+      </w:r>
+    </w:p>
+    <w:p>
+      <w:pPr>
+        <w:pStyle w:val="Normal"/>
+        <w:rPr/>
+      </w:pPr>
+      <w:r>
+        <w:rPr/>
+      </w:r>
+    </w:p>
+    <w:p>
+      <w:pPr>
+        <w:pStyle w:val="Overskrift2"/>
+        <w:rPr/>
+      </w:pPr>
+      <w:r>
+        <w:rPr/>
+        <w:t xml:space="preserve">Maria gennem torne går Test 3 </w:t>
+      </w:r>
+    </w:p>
+    <w:p>
+      <w:pPr>
+        <w:pStyle w:val="Normal"/>
+        <w:rPr/>
+      </w:pPr>
+      <w:r>
+        <w:rPr/>
+        <w:t xml:space="preserve">Taget fra eksempelsamlingen i nodelæseren under julemusik </w:t>
+      </w:r>
+    </w:p>
+    <w:p>
+      <w:pPr>
+        <w:pStyle w:val="Normal"/>
+        <w:rPr/>
+      </w:pPr>
+      <w:r>
+        <w:rPr/>
+        <w:t xml:space="preserve">Visning af bistemmer og intervaller på punktnotatapparat u2mini </w:t>
+      </w:r>
+    </w:p>
+    <w:p>
+      <w:pPr>
+        <w:pStyle w:val="Normal"/>
+        <w:rPr/>
+      </w:pPr>
+      <w:r>
+        <w:rPr/>
+        <w:t xml:space="preserve">Punktnotatprofil indstillet til: </w:t>
+      </w:r>
+    </w:p>
+    <w:p>
+      <w:pPr>
+        <w:pStyle w:val="ListParagraph"/>
+        <w:numPr>
+          <w:ilvl w:val="0"/>
+          <w:numId w:val="1"/>
+        </w:numPr>
+        <w:rPr/>
+      </w:pPr>
+      <w:r>
+        <w:rPr/>
+        <w:t xml:space="preserve">Braille format .txt (OctoBraille 1252) </w:t>
+      </w:r>
+    </w:p>
+    <w:p>
+      <w:pPr>
+        <w:pStyle w:val="ListParagraph"/>
+        <w:numPr>
+          <w:ilvl w:val="0"/>
+          <w:numId w:val="1"/>
+        </w:numPr>
+        <w:rPr/>
+      </w:pPr>
+      <w:r>
+        <w:rPr/>
+        <w:t xml:space="preserve">Braille side opstilling Bana 2015 </w:t>
+      </w:r>
+    </w:p>
+    <w:p>
+      <w:pPr>
+        <w:pStyle w:val="ListParagraph"/>
+        <w:numPr>
+          <w:ilvl w:val="0"/>
+          <w:numId w:val="1"/>
+        </w:numPr>
+        <w:rPr/>
+      </w:pPr>
+      <w:r>
+        <w:rPr/>
+        <w:t xml:space="preserve">Braille sidebredde 32 </w:t>
+      </w:r>
+    </w:p>
+    <w:p>
+      <w:pPr>
+        <w:pStyle w:val="ListParagraph"/>
+        <w:numPr>
+          <w:ilvl w:val="0"/>
+          <w:numId w:val="1"/>
+        </w:numPr>
+        <w:rPr/>
+      </w:pPr>
+      <w:r>
+        <w:rPr/>
+        <w:t xml:space="preserve">Notatapparatnavn U2 Mini og polaris </w:t>
+      </w:r>
+    </w:p>
+    <w:p>
+      <w:pPr>
+        <w:pStyle w:val="Normal"/>
+        <w:rPr/>
+      </w:pPr>
+      <w:r>
+        <w:rPr/>
+      </w:r>
+    </w:p>
+    <w:p>
+      <w:pPr>
+        <w:pStyle w:val="Normal"/>
+        <w:rPr/>
+      </w:pPr>
+      <w:r>
+        <w:rPr/>
+        <w:t xml:space="preserve">Dette ligner langt mere noder end test 1. Men der er noget med læseretning i forhold til bistemmer, starter læseretningen fra bassen og opad og gælder dette hele stykket i gennem? Der er også noget med lille bistemmetegn kontra stor bistemmetegn. Efter skilletegn ved lille bistemmetegn skal altid bruges oktavtegn til den node, som kommer lige efter skilletegnet gældende for begge stemmer. Lille bistemme har traditionelt været anvendt, hvor stemmerne i kun en del af samme takt er så rytmisk forskellige, at de ikke kan noteres med intervaltegn. Store bistemmer har været andventd, hvor stemmerne inden for den pågældende takt har været så rytmisk forskellige, at intervaltegn ikke har kunnet anvendes i nogen del af takten. For store bistemmer gælder, at der skal oktavtegn. Jeg ved ikke, om de amerikanske regler mht. bistemmer ligner de regler, som har været andvendt i den danske brailleske nodeskrift grundbog 1 fra enten 1976 eller 1978, som jeg har en udgave af stående på punkt. Desværre har jeg heller ikke noget isbn. Nr. på denne punktbog. Lille bistemme består af pkt 5 og i næste skriverum pkt 2. Skilletegn kun anvendt sammen med lillebistemme består af pkt 46 og i næsteskriverum pkt 13. Stor bistemme består af pkt 126 og i næste skriverum pkt 345. </w:t>
+      </w:r>
+    </w:p>
+    <w:p>
+      <w:pPr>
+        <w:pStyle w:val="Normal"/>
+        <w:rPr>
+          <w:color w:val="FF0000"/>
+        </w:rPr>
+      </w:pPr>
+      <w:r>
+        <w:rPr>
+          <w:color w:val="FF0000"/>
+        </w:rPr>
+        <w:t>JSJ: Så vi må antage at U2 Mini og Polaris skal fodres med Octobraille 1252 og ikke spiser ASCII. Læseretningen forventes at være (Oppefra og ned for SA) (Nedefra og op for BT) (??? for TUTTI og SATB) . Læseretningen forventes at være den samme hele filen igennem.</w:t>
       </w:r>
     </w:p>
     <w:p>
@@ -2823,6 +2906,7 @@
       </w:pPr>
       <w:rPr>
         <w:rFonts w:ascii="Symbol" w:hAnsi="Symbol" w:cs="Symbol" w:hint="default"/>
+        <w:rFonts w:cs="Symbol"/>
       </w:rPr>
     </w:lvl>
     <w:lvl w:ilvl="1">
@@ -2848,6 +2932,7 @@
       </w:pPr>
       <w:rPr>
         <w:rFonts w:ascii="Wingdings" w:hAnsi="Wingdings" w:cs="Wingdings" w:hint="default"/>
+        <w:rFonts w:cs="Wingdings"/>
       </w:rPr>
     </w:lvl>
     <w:lvl w:ilvl="3">
@@ -2860,6 +2945,7 @@
       </w:pPr>
       <w:rPr>
         <w:rFonts w:ascii="Symbol" w:hAnsi="Symbol" w:cs="Symbol" w:hint="default"/>
+        <w:rFonts w:cs="Symbol"/>
       </w:rPr>
     </w:lvl>
     <w:lvl w:ilvl="4">
@@ -2885,6 +2971,7 @@
       </w:pPr>
       <w:rPr>
         <w:rFonts w:ascii="Wingdings" w:hAnsi="Wingdings" w:cs="Wingdings" w:hint="default"/>
+        <w:rFonts w:cs="Wingdings"/>
       </w:rPr>
     </w:lvl>
     <w:lvl w:ilvl="6">
@@ -2897,6 +2984,7 @@
       </w:pPr>
       <w:rPr>
         <w:rFonts w:ascii="Symbol" w:hAnsi="Symbol" w:cs="Symbol" w:hint="default"/>
+        <w:rFonts w:cs="Symbol"/>
       </w:rPr>
     </w:lvl>
     <w:lvl w:ilvl="7">
@@ -2922,6 +3010,7 @@
       </w:pPr>
       <w:rPr>
         <w:rFonts w:ascii="Wingdings" w:hAnsi="Wingdings" w:cs="Wingdings" w:hint="default"/>
+        <w:rFonts w:cs="Wingdings"/>
       </w:rPr>
     </w:lvl>
   </w:abstractNum>
@@ -3032,7 +3121,6 @@
     <w:rPrDefault>
       <w:rPr>
         <w:rFonts w:ascii="Calibri" w:hAnsi="Calibri" w:eastAsia="Calibri" w:cs="" w:asciiTheme="minorHAnsi" w:cstheme="minorBidi" w:eastAsiaTheme="minorHAnsi" w:hAnsiTheme="minorHAnsi"/>
-        <w:sz w:val="22"/>
         <w:szCs w:val="22"/>
         <w:lang w:val="da-DK" w:eastAsia="en-US" w:bidi="ar-SA"/>
       </w:rPr>
@@ -3425,7 +3513,7 @@
     </w:pPr>
     <w:rPr>
       <w:rFonts w:ascii="Calibri" w:hAnsi="Calibri" w:eastAsia="Calibri" w:cs="" w:asciiTheme="minorHAnsi" w:cstheme="minorBidi" w:eastAsiaTheme="minorHAnsi" w:hAnsiTheme="minorHAnsi"/>
-      <w:color w:val="auto"/>
+      <w:color w:val="00000A"/>
       <w:sz w:val="22"/>
       <w:szCs w:val="22"/>
       <w:lang w:val="da-DK" w:eastAsia="en-US" w:bidi="ar-SA"/>
@@ -3565,6 +3653,69 @@
     <w:qFormat/>
     <w:rPr>
       <w:rFonts w:cs="Courier New"/>
+    </w:rPr>
+  </w:style>
+  <w:style w:type="character" w:styleId="ListLabel4">
+    <w:name w:val="ListLabel 4"/>
+    <w:qFormat/>
+    <w:rPr>
+      <w:rFonts w:cs="Symbol"/>
+    </w:rPr>
+  </w:style>
+  <w:style w:type="character" w:styleId="ListLabel5">
+    <w:name w:val="ListLabel 5"/>
+    <w:qFormat/>
+    <w:rPr>
+      <w:rFonts w:cs="Courier New"/>
+    </w:rPr>
+  </w:style>
+  <w:style w:type="character" w:styleId="ListLabel6">
+    <w:name w:val="ListLabel 6"/>
+    <w:qFormat/>
+    <w:rPr>
+      <w:rFonts w:cs="Wingdings"/>
+    </w:rPr>
+  </w:style>
+  <w:style w:type="character" w:styleId="ListLabel7">
+    <w:name w:val="ListLabel 7"/>
+    <w:qFormat/>
+    <w:rPr>
+      <w:rFonts w:cs="Symbol"/>
+    </w:rPr>
+  </w:style>
+  <w:style w:type="character" w:styleId="ListLabel8">
+    <w:name w:val="ListLabel 8"/>
+    <w:qFormat/>
+    <w:rPr>
+      <w:rFonts w:cs="Courier New"/>
+    </w:rPr>
+  </w:style>
+  <w:style w:type="character" w:styleId="ListLabel9">
+    <w:name w:val="ListLabel 9"/>
+    <w:qFormat/>
+    <w:rPr>
+      <w:rFonts w:cs="Wingdings"/>
+    </w:rPr>
+  </w:style>
+  <w:style w:type="character" w:styleId="ListLabel10">
+    <w:name w:val="ListLabel 10"/>
+    <w:qFormat/>
+    <w:rPr>
+      <w:rFonts w:cs="Symbol"/>
+    </w:rPr>
+  </w:style>
+  <w:style w:type="character" w:styleId="ListLabel11">
+    <w:name w:val="ListLabel 11"/>
+    <w:qFormat/>
+    <w:rPr>
+      <w:rFonts w:cs="Courier New"/>
+    </w:rPr>
+  </w:style>
+  <w:style w:type="character" w:styleId="ListLabel12">
+    <w:name w:val="ListLabel 12"/>
+    <w:qFormat/>
+    <w:rPr>
+      <w:rFonts w:cs="Wingdings"/>
     </w:rPr>
   </w:style>
   <w:style w:type="paragraph" w:styleId="Overskrift">

</xml_diff>

<commit_message>
More comments and added entry to todo
</commit_message>
<xml_diff>
--- a/Documentation/TEst reports/3.3/Test Ibos nodelæser 3 3 kommentarer Susanne.docx
+++ b/Documentation/TEst reports/3.3/Test Ibos nodelæser 3 3 kommentarer Susanne.docx
@@ -1152,7 +1152,9 @@
         </w:rPr>
       </w:pPr>
       <w:r>
-        <w:rPr/>
+        <w:rPr>
+          <w:color w:val="FF3333"/>
+        </w:rPr>
       </w:r>
       <w:r>
         <w:br w:type="page"/>
@@ -1166,7 +1168,9 @@
         </w:rPr>
       </w:pPr>
       <w:r>
-        <w:rPr/>
+        <w:rPr>
+          <w:color w:val="FF3333"/>
+        </w:rPr>
       </w:r>
     </w:p>
     <w:p>
@@ -1198,13 +1202,23 @@
         <w:rPr>
           <w:color w:val="FF6600"/>
         </w:rPr>
-        <w:t>J</w:t>
-      </w:r>
+        <w:t>JSJ Slag 1-3:</w:t>
+      </w:r>
+    </w:p>
+    <w:p>
+      <w:pPr>
+        <w:pStyle w:val="Normal"/>
+        <w:rPr/>
+      </w:pPr>
       <w:r>
         <w:rPr>
           <w:color w:val="FF6600"/>
         </w:rPr>
-        <w:t>SJ Slag 1-3:</w:t>
+        <w:t>JSJ: B:</w:t>
+      </w:r>
+      <w:r>
+        <w:rPr/>
+        <w:t xml:space="preserve"> 2 oktavk a en halv cis fjerdedel overbinding start </w:t>
       </w:r>
     </w:p>
     <w:p>
@@ -1216,11 +1230,68 @@
         <w:rPr>
           <w:color w:val="FF6600"/>
         </w:rPr>
+        <w:t xml:space="preserve">JSJ: T: </w:t>
+      </w:r>
+      <w:r>
+        <w:rPr/>
+        <w:t xml:space="preserve">lille bistemmetegn 5 oktavk cis en halv b fjerdedel overbinding start </w:t>
+      </w:r>
+    </w:p>
+    <w:p>
+      <w:pPr>
+        <w:pStyle w:val="Normal"/>
+        <w:rPr/>
+      </w:pPr>
+      <w:r>
+        <w:rPr>
+          <w:color w:val="FF6600"/>
+        </w:rPr>
+        <w:t xml:space="preserve">JSJ: A: </w:t>
+      </w:r>
+      <w:r>
+        <w:rPr/>
+        <w:t>lille bistemmetegn tilføj 4 oktav gis fjerdedel overbinding stop (der skal altid oktavtegn efter skilletegn og bistemmetegnet uanset om det er stort eller lille)! Fis en halv skilletegn (korrekt angivet oktavtegn efter skilletegn og bistemmetegn) 3 oktav</w:t>
+      </w:r>
+    </w:p>
+    <w:p>
+      <w:pPr>
+        <w:pStyle w:val="Normal"/>
+        <w:rPr>
+          <w:color w:val="FF6600"/>
+        </w:rPr>
+      </w:pPr>
+      <w:r>
+        <w:rPr>
+          <w:color w:val="FF6600"/>
+        </w:rPr>
+      </w:r>
+    </w:p>
+    <w:p>
+      <w:pPr>
+        <w:pStyle w:val="Normal"/>
+        <w:rPr/>
+      </w:pPr>
+      <w:r>
+        <w:rPr>
+          <w:color w:val="FF6600"/>
+        </w:rPr>
+        <w:t>JSJ: Slag 4:</w:t>
+      </w:r>
+    </w:p>
+    <w:p>
+      <w:pPr>
+        <w:pStyle w:val="Normal"/>
+        <w:rPr/>
+      </w:pPr>
+      <w:r>
+        <w:rPr>
+          <w:color w:val="FF6600"/>
+        </w:rPr>
         <w:t>JSJ: B:</w:t>
       </w:r>
       <w:r>
         <w:rPr/>
-        <w:t xml:space="preserve"> 2 oktavk a en halv cis fjerdedel overbinding start </w:t>
+        <w:t xml:space="preserve"> cis fjerdedel overbinding stop</w:t>
       </w:r>
     </w:p>
     <w:p>
@@ -1236,7 +1307,7 @@
       </w:r>
       <w:r>
         <w:rPr/>
-        <w:t xml:space="preserve">lille bistemmetegn 5 oktavk cis en halv b fjerdedel overbinding start </w:t>
+        <w:t xml:space="preserve">lille bistemmetegn 4 oktav b fjerdedel overbinding stop </w:t>
       </w:r>
     </w:p>
     <w:p>
@@ -1248,98 +1319,11 @@
         <w:rPr>
           <w:color w:val="FF6600"/>
         </w:rPr>
-        <w:t xml:space="preserve">JSJ: A: </w:t>
-      </w:r>
-      <w:r>
-        <w:rPr/>
-        <w:t>lille bistemmetegn tilføj 4 oktav gis fjerdedel overbinding stop (der skal altid oktavtegn efter skilletegn og bistemmetegnet uanset om det er stort eller lille)! Fis en halv skilletegn (korrekt angivet oktavtegn efter skilletegn og bistemmetegn) 3 oktav</w:t>
-      </w:r>
-    </w:p>
-    <w:p>
-      <w:pPr>
-        <w:pStyle w:val="Normal"/>
-        <w:rPr>
-          <w:color w:val="FF6600"/>
-        </w:rPr>
-      </w:pPr>
-      <w:r>
-        <w:rPr/>
-      </w:r>
-    </w:p>
-    <w:p>
-      <w:pPr>
-        <w:pStyle w:val="Normal"/>
-        <w:rPr/>
-      </w:pPr>
-      <w:r>
-        <w:rPr>
-          <w:color w:val="FF6600"/>
-        </w:rPr>
-        <w:t>J</w:t>
-      </w:r>
-      <w:r>
-        <w:rPr>
-          <w:color w:val="FF6600"/>
-        </w:rPr>
-        <w:t>SJ: Slag 4:</w:t>
-      </w:r>
-    </w:p>
-    <w:p>
-      <w:pPr>
-        <w:pStyle w:val="Normal"/>
-        <w:rPr/>
-      </w:pPr>
-      <w:r>
-        <w:rPr>
-          <w:color w:val="FF6600"/>
-        </w:rPr>
-        <w:t>JSJ: B:</w:t>
-      </w:r>
-      <w:r>
-        <w:rPr/>
-        <w:t xml:space="preserve"> cis fjerdedel overbinding stop</w:t>
-      </w:r>
-    </w:p>
-    <w:p>
-      <w:pPr>
-        <w:pStyle w:val="Normal"/>
-        <w:rPr/>
-      </w:pPr>
-      <w:r>
-        <w:rPr>
-          <w:color w:val="FF6600"/>
-        </w:rPr>
-        <w:t>JSJ: T:</w:t>
-      </w:r>
-      <w:r>
-        <w:rPr>
-          <w:color w:val="FF6600"/>
-        </w:rPr>
-        <w:t xml:space="preserve"> </w:t>
-      </w:r>
-      <w:r>
-        <w:rPr/>
-        <w:t xml:space="preserve">lille bistemmetegn 4 oktav b fjerdedel overbinding stop </w:t>
-      </w:r>
-    </w:p>
-    <w:p>
-      <w:pPr>
-        <w:pStyle w:val="Normal"/>
-        <w:rPr/>
-      </w:pPr>
-      <w:r>
-        <w:rPr>
-          <w:color w:val="FF6600"/>
-        </w:rPr>
         <w:t>JSJ: A:</w:t>
       </w:r>
       <w:r>
         <w:rPr/>
-        <w:t xml:space="preserve"> </w:t>
-      </w:r>
-      <w:r>
-        <w:rPr/>
-        <w:t>lille bistemmetegn 4 oktav eis ottendedel overbinding start eis ottendedel overbinding stop</w:t>
+        <w:t xml:space="preserve"> lille bistemmetegn 4 oktav eis ottendedel overbinding start eis ottendedel overbinding stop</w:t>
       </w:r>
     </w:p>
     <w:p>
@@ -1620,11 +1604,117 @@
     <w:p>
       <w:pPr>
         <w:pStyle w:val="Normal"/>
-        <w:rPr/>
-      </w:pPr>
-      <w:r>
-        <w:rPr/>
-        <w:t xml:space="preserve">Skilletegn 3 oktav fis fjerdedel gis fjerdedel lille bistemme 4 oktavk a fjerdedel b fjerdedel lille bistemme 4 oktav gis fjerdedel fis fjerdedel lille bistemme 5 oktavk cis punkteret fjerdedel b ottendedel 3 oktav a fjerdedel a ottendedel med 5 oktav terts 5 oktav terts skilletegn ais fjerdedel lille bistemme 5 oktavk cis fjerdedel lille bistemme opløsning 4 oktav g lille bistemme 5 oktav d ottendedel bindebue cis ottendedel bindebue </w:t>
+        <w:rPr>
+          <w:color w:val="800000"/>
+        </w:rPr>
+      </w:pPr>
+      <w:r>
+        <w:rPr>
+          <w:color w:val="800000"/>
+        </w:rPr>
+        <w:t>JSJ: Slag 1-2</w:t>
+      </w:r>
+    </w:p>
+    <w:p>
+      <w:pPr>
+        <w:pStyle w:val="Normal"/>
+        <w:rPr/>
+      </w:pPr>
+      <w:r>
+        <w:rPr>
+          <w:color w:val="800000"/>
+        </w:rPr>
+        <w:t>JSJ: B:</w:t>
+      </w:r>
+      <w:r>
+        <w:rPr/>
+        <w:t xml:space="preserve"> </w:t>
+      </w:r>
+      <w:r>
+        <w:rPr/>
+        <w:t xml:space="preserve">Skilletegn 3 oktav fis fjerdedel gis fjerdedel </w:t>
+      </w:r>
+    </w:p>
+    <w:p>
+      <w:pPr>
+        <w:pStyle w:val="Normal"/>
+        <w:rPr/>
+      </w:pPr>
+      <w:r>
+        <w:rPr>
+          <w:color w:val="800000"/>
+        </w:rPr>
+        <w:t>JSJ: T:</w:t>
+      </w:r>
+      <w:r>
+        <w:rPr/>
+        <w:t xml:space="preserve"> </w:t>
+      </w:r>
+      <w:r>
+        <w:rPr/>
+        <w:t>lille bistemme 4 oktavk a fjerdedel b fjerdedel</w:t>
+      </w:r>
+    </w:p>
+    <w:p>
+      <w:pPr>
+        <w:pStyle w:val="Normal"/>
+        <w:rPr/>
+      </w:pPr>
+      <w:r>
+        <w:rPr>
+          <w:color w:val="800000"/>
+        </w:rPr>
+        <w:t>JSJ: A:</w:t>
+      </w:r>
+      <w:r>
+        <w:rPr/>
+        <w:t xml:space="preserve"> </w:t>
+      </w:r>
+      <w:r>
+        <w:rPr/>
+        <w:t xml:space="preserve"> lille bistemme 4 oktav gis fjerdedel fis fjerdedel</w:t>
+      </w:r>
+    </w:p>
+    <w:p>
+      <w:pPr>
+        <w:pStyle w:val="Normal"/>
+        <w:rPr/>
+      </w:pPr>
+      <w:r>
+        <w:rPr/>
+        <w:t xml:space="preserve">JSJ: S: </w:t>
+      </w:r>
+      <w:r>
+        <w:rPr/>
+        <w:t xml:space="preserve"> lille bistemme 5 oktavk cis punkteret fjerdedel b ottendedel</w:t>
+      </w:r>
+    </w:p>
+    <w:p>
+      <w:pPr>
+        <w:pStyle w:val="Normal"/>
+        <w:rPr>
+          <w:color w:val="800000"/>
+        </w:rPr>
+      </w:pPr>
+      <w:r>
+        <w:rPr>
+          <w:color w:val="800000"/>
+        </w:rPr>
+        <w:t>JSJ: Her mangler tydeligvis et skilletegn ! Slag 3-4:</w:t>
+      </w:r>
+    </w:p>
+    <w:p>
+      <w:pPr>
+        <w:pStyle w:val="Normal"/>
+        <w:rPr/>
+      </w:pPr>
+      <w:r>
+        <w:rPr/>
+        <w:t>JSJ: B:</w:t>
+      </w:r>
+      <w:r>
+        <w:rPr/>
+        <w:t xml:space="preserve"> 3 oktav a fjerdedel a ottendedel med 5 oktav terts 5 oktav terts skilletegn ais fjerdedel lille bistemme 5 oktavk cis fjerdedel lille bistemme opløsning 4 oktav g lille bistemme 5 oktav d ottendedel bindebue cis ottendedel bindebue </w:t>
       </w:r>
     </w:p>
     <w:p>
@@ -1649,6 +1739,215 @@
     <w:p>
       <w:pPr>
         <w:pStyle w:val="Normal"/>
+        <w:rPr>
+          <w:color w:val="800000"/>
+        </w:rPr>
+      </w:pPr>
+      <w:r>
+        <w:rPr>
+          <w:color w:val="800000"/>
+        </w:rPr>
+        <w:t xml:space="preserve">JSJ: Det skyldes en kombination af 3 ting: </w:t>
+      </w:r>
+    </w:p>
+    <w:p>
+      <w:pPr>
+        <w:pStyle w:val="Normal"/>
+        <w:rPr>
+          <w:color w:val="800000"/>
+        </w:rPr>
+      </w:pPr>
+      <w:r>
+        <w:rPr>
+          <w:color w:val="800000"/>
+        </w:rPr>
+        <w:t>1: Tenoren er noteret en oktav for højt, derfor er tenorens cis højere end altens gis.</w:t>
+      </w:r>
+    </w:p>
+    <w:p>
+      <w:pPr>
+        <w:pStyle w:val="Normal"/>
+        <w:rPr>
+          <w:color w:val="800000"/>
+        </w:rPr>
+      </w:pPr>
+      <w:r>
+        <w:rPr>
+          <w:color w:val="800000"/>
+        </w:rPr>
+        <w:t>2: I intervalnotationen ordnes intervallerne pt efter frekvens, ikke (som de burde) efter stemme. Derfor ombyttes stemmerne ved stemmekryds. Så programmet forsøger at skrive:</w:t>
+      </w:r>
+    </w:p>
+    <w:p>
+      <w:pPr>
+        <w:pStyle w:val="Normal"/>
+        <w:rPr>
+          <w:color w:val="800000"/>
+        </w:rPr>
+      </w:pPr>
+      <w:r>
+        <w:rPr>
+          <w:color w:val="800000"/>
+        </w:rPr>
+        <w:t xml:space="preserve"> </w:t>
+      </w:r>
+      <w:r>
+        <w:rPr>
+          <w:color w:val="800000"/>
+        </w:rPr>
+        <w:t>A</w:t>
+      </w:r>
+      <w:r>
+        <w:rPr>
+          <w:color w:val="800000"/>
+        </w:rPr>
+        <w:t xml:space="preserve"> fjerdede</w:t>
+      </w:r>
+      <w:r>
+        <w:rPr>
+          <w:color w:val="800000"/>
+        </w:rPr>
+        <w:t>l</w:t>
+      </w:r>
+      <w:r>
+        <w:rPr>
+          <w:color w:val="800000"/>
+        </w:rPr>
+        <w:t xml:space="preserve">, </w:t>
+      </w:r>
+      <w:r>
+        <w:rPr>
+          <w:color w:val="800000"/>
+        </w:rPr>
+        <w:t>septim (altens)</w:t>
+      </w:r>
+      <w:r>
+        <w:rPr>
+          <w:color w:val="800000"/>
+        </w:rPr>
+        <w:t xml:space="preserve"> , </w:t>
+      </w:r>
+      <w:r>
+        <w:rPr>
+          <w:color w:val="800000"/>
+        </w:rPr>
+        <w:t>terts (tenorens), terts (sopranens)</w:t>
+      </w:r>
+    </w:p>
+    <w:p>
+      <w:pPr>
+        <w:pStyle w:val="Normal"/>
+        <w:rPr>
+          <w:color w:val="800000"/>
+        </w:rPr>
+      </w:pPr>
+      <w:r>
+        <w:rPr>
+          <w:color w:val="800000"/>
+        </w:rPr>
+        <w:t>3: Septim skrives som omtalt i 3.3 fejlagtigt som (dot2 + dot4) = en ottendedelsnode.</w:t>
+      </w:r>
+    </w:p>
+    <w:p>
+      <w:pPr>
+        <w:pStyle w:val="Normal"/>
+        <w:rPr>
+          <w:color w:val="800000"/>
+        </w:rPr>
+      </w:pPr>
+      <w:r>
+        <w:rPr>
+          <w:color w:val="800000"/>
+        </w:rPr>
+        <w:t>Der er noget, der ikke stemmer helt her, for dot2+dot4 er ikke a.</w:t>
+      </w:r>
+    </w:p>
+    <w:p>
+      <w:pPr>
+        <w:pStyle w:val="Normal"/>
+        <w:rPr>
+          <w:color w:val="800000"/>
+        </w:rPr>
+      </w:pPr>
+      <w:r>
+        <w:rPr>
+          <w:color w:val="800000"/>
+        </w:rPr>
+        <w:t xml:space="preserve">Under alle omstændigheder viser 3.4 </w:t>
+      </w:r>
+    </w:p>
+    <w:p>
+      <w:pPr>
+        <w:pStyle w:val="Normal"/>
+        <w:rPr>
+          <w:color w:val="800000"/>
+        </w:rPr>
+      </w:pPr>
+      <w:r>
+        <w:rPr>
+          <w:color w:val="800000"/>
+        </w:rPr>
+        <w:t>a fjerdedel + septim + terts + terts</w:t>
+      </w:r>
+    </w:p>
+    <w:p>
+      <w:pPr>
+        <w:pStyle w:val="Normal"/>
+        <w:rPr>
+          <w:color w:val="800000"/>
+        </w:rPr>
+      </w:pPr>
+      <w:r>
+        <w:rPr>
+          <w:color w:val="800000"/>
+        </w:rPr>
+      </w:r>
+    </w:p>
+    <w:p>
+      <w:pPr>
+        <w:pStyle w:val="Normal"/>
+        <w:rPr>
+          <w:color w:val="800000"/>
+        </w:rPr>
+      </w:pPr>
+      <w:r>
+        <w:rPr>
+          <w:color w:val="800000"/>
+        </w:rPr>
+        <w:t>hvilket er korrekt bortset fra at man kan diskutere rækkefølgen af intervallerne.</w:t>
+      </w:r>
+    </w:p>
+    <w:p>
+      <w:pPr>
+        <w:pStyle w:val="Normal"/>
+        <w:rPr>
+          <w:color w:val="800000"/>
+        </w:rPr>
+      </w:pPr>
+      <w:r>
+        <w:rPr>
+          <w:color w:val="800000"/>
+        </w:rPr>
+        <w:t>Og selvfølgelig bured takt 6 skrives som stor bistemme i stedet for dette miskmask af</w:t>
+      </w:r>
+    </w:p>
+    <w:p>
+      <w:pPr>
+        <w:pStyle w:val="Normal"/>
+        <w:rPr>
+          <w:color w:val="800000"/>
+        </w:rPr>
+      </w:pPr>
+      <w:r>
+        <w:rPr>
+          <w:color w:val="800000"/>
+        </w:rPr>
+        <w:t>lille bistemme i slag 1+2 + intervalnotation i slag 3  + lille bistemme i slag 4</w:t>
+      </w:r>
+    </w:p>
+    <w:p>
+      <w:pPr>
+        <w:pStyle w:val="Normal"/>
         <w:rPr/>
       </w:pPr>
       <w:r>
@@ -1672,26 +1971,83 @@
       </w:pPr>
       <w:r>
         <w:rPr/>
-        <w:t xml:space="preserve">Sopran og alt: 5 oktav punkteret cis fjerdedel b ottendedel cis fjerdedel d ottendedel legato stop cis ottendedel legato stop stor bistemme 4 oktav gis fjerdedel fis fjerdedel gis fjerdedel opløsning g fjerdedel ny takt </w:t>
-      </w:r>
-    </w:p>
-    <w:p>
-      <w:pPr>
-        <w:pStyle w:val="Normal"/>
-        <w:rPr/>
-      </w:pPr>
-      <w:r>
-        <w:rPr/>
-      </w:r>
-    </w:p>
-    <w:p>
-      <w:pPr>
-        <w:pStyle w:val="Normal"/>
-        <w:rPr/>
-      </w:pPr>
-      <w:r>
-        <w:rPr/>
-        <w:t xml:space="preserve">Bas og tenor: 3 oktav fis fjerdedel med 4 oktav terts gis fjerdedel med 4 oktav terts a fjerdedel med 5 oktav terts ais fjerdedel med 5 oktav terts ny takt </w:t>
+        <w:t xml:space="preserve">Sopran og alt: </w:t>
+      </w:r>
+    </w:p>
+    <w:p>
+      <w:pPr>
+        <w:pStyle w:val="Normal"/>
+        <w:rPr/>
+      </w:pPr>
+      <w:r>
+        <w:rPr>
+          <w:color w:val="800000"/>
+        </w:rPr>
+        <w:t>JSJ: S:</w:t>
+      </w:r>
+      <w:r>
+        <w:rPr/>
+        <w:t xml:space="preserve"> </w:t>
+      </w:r>
+      <w:r>
+        <w:rPr/>
+        <w:t xml:space="preserve">5 oktav punkteret cis fjerdedel b ottendedel cis fjerdedel d ottendedel legato stop cis ottendedel legato stop </w:t>
+      </w:r>
+    </w:p>
+    <w:p>
+      <w:pPr>
+        <w:pStyle w:val="Normal"/>
+        <w:rPr/>
+      </w:pPr>
+      <w:r>
+        <w:rPr>
+          <w:color w:val="800000"/>
+        </w:rPr>
+        <w:t xml:space="preserve">JSJ: A: </w:t>
+      </w:r>
+      <w:r>
+        <w:rPr/>
+        <w:t xml:space="preserve">stor bistemme 4 oktav gis fjerdedel fis fjerdedel gis fjerdedel opløsning g fjerdedel ny takt </w:t>
+      </w:r>
+    </w:p>
+    <w:p>
+      <w:pPr>
+        <w:pStyle w:val="Normal"/>
+        <w:rPr/>
+      </w:pPr>
+      <w:r>
+        <w:rPr/>
+        <w:t>Bas og tenor:</w:t>
+      </w:r>
+    </w:p>
+    <w:p>
+      <w:pPr>
+        <w:pStyle w:val="Normal"/>
+        <w:rPr/>
+      </w:pPr>
+      <w:r>
+        <w:rPr>
+          <w:color w:val="FF6600"/>
+        </w:rPr>
+        <w:t>JSJ: B+T:</w:t>
+      </w:r>
+      <w:r>
+        <w:rPr/>
+        <w:t xml:space="preserve"> 3 oktav fis fjerdedel med 4 oktav terts gis fjerdedel med 4 oktav terts a fjerdedel med 5 oktav terts ais fjerdedel med 5 oktav terts ny takt </w:t>
+      </w:r>
+    </w:p>
+    <w:p>
+      <w:pPr>
+        <w:pStyle w:val="Normal"/>
+        <w:rPr>
+          <w:color w:val="FF6600"/>
+        </w:rPr>
+      </w:pPr>
+      <w:r>
+        <w:rPr>
+          <w:color w:val="FF6600"/>
+        </w:rPr>
+        <w:t>JSJ: Helt enig, hvis vi taler om separate SA + BT, men hvis vi taler TUTTI er man vel nødt til at anvende stor bistemme gennemgående ?</w:t>
       </w:r>
     </w:p>
     <w:p>
@@ -1720,16 +2076,201 @@
       </w:pPr>
       <w:r>
         <w:rPr/>
-        <w:t xml:space="preserve">Ingen skilletegn i starten af takten 3 oktav fis fjerdedel gis fjerdedel lille bistemme 4 oktav a fjerdedel b fjerdedel lille bistemme 4 oktav gis fjerdedel fis fjerdedel lille bistemme 5 oktav punkteret cis fjerdedel b ottendedel skilletegn 3 oktav a fjerdedel 5 oktav terts 4 oktav septim 5 oktav terts skilletegn 3 oktav ais fjerdedel lille bistemme 5 oktav cis fjerdedel lille bistemme 4 oktav g fjerdedel lille bistemme 5 oktav d ottendedel legato stop cis ottendedel legato stop ny takt </w:t>
-      </w:r>
-    </w:p>
-    <w:p>
-      <w:pPr>
-        <w:pStyle w:val="Normal"/>
-        <w:rPr/>
-      </w:pPr>
-      <w:r>
-        <w:rPr/>
+        <w:t>Ingen skilletegn i starten af takten</w:t>
+      </w:r>
+    </w:p>
+    <w:p>
+      <w:pPr>
+        <w:pStyle w:val="Normal"/>
+        <w:rPr>
+          <w:color w:val="FF6600"/>
+        </w:rPr>
+      </w:pPr>
+      <w:r>
+        <w:rPr>
+          <w:color w:val="FF6600"/>
+        </w:rPr>
+        <w:t>JSJ: Slag 1-2</w:t>
+      </w:r>
+    </w:p>
+    <w:p>
+      <w:pPr>
+        <w:pStyle w:val="Normal"/>
+        <w:rPr/>
+      </w:pPr>
+      <w:r>
+        <w:rPr/>
+        <w:t xml:space="preserve">JSJ: B: </w:t>
+      </w:r>
+      <w:r>
+        <w:rPr/>
+        <w:t xml:space="preserve"> 3 oktav fis fjerdedel gis fjerdedel </w:t>
+      </w:r>
+    </w:p>
+    <w:p>
+      <w:pPr>
+        <w:pStyle w:val="Normal"/>
+        <w:rPr/>
+      </w:pPr>
+      <w:r>
+        <w:rPr/>
+        <w:t xml:space="preserve">JSJ: T: </w:t>
+      </w:r>
+      <w:r>
+        <w:rPr/>
+        <w:t>lille bistemme 4 oktav a fjerdedel b fjerdedel</w:t>
+      </w:r>
+    </w:p>
+    <w:p>
+      <w:pPr>
+        <w:pStyle w:val="Normal"/>
+        <w:rPr/>
+      </w:pPr>
+      <w:r>
+        <w:rPr/>
+        <w:t>JSJ: A:</w:t>
+      </w:r>
+      <w:r>
+        <w:rPr/>
+        <w:t xml:space="preserve"> lille bistemme 4 oktav gis fjerdedel fis fjerdedel</w:t>
+      </w:r>
+    </w:p>
+    <w:p>
+      <w:pPr>
+        <w:pStyle w:val="Normal"/>
+        <w:rPr/>
+      </w:pPr>
+      <w:r>
+        <w:rPr/>
+        <w:t xml:space="preserve">JSJ: S: </w:t>
+      </w:r>
+      <w:r>
+        <w:rPr/>
+        <w:t xml:space="preserve"> lille bistemme 5 oktav punkteret cis fjerdedel b ottendedel skilletegn</w:t>
+      </w:r>
+    </w:p>
+    <w:p>
+      <w:pPr>
+        <w:pStyle w:val="Normal"/>
+        <w:rPr/>
+      </w:pPr>
+      <w:r>
+        <w:rPr/>
+        <w:t>JSJ: Slag 3</w:t>
+      </w:r>
+    </w:p>
+    <w:p>
+      <w:pPr>
+        <w:pStyle w:val="Normal"/>
+        <w:rPr/>
+      </w:pPr>
+      <w:r>
+        <w:rPr/>
+        <w:t xml:space="preserve"> </w:t>
+      </w:r>
+      <w:r>
+        <w:rPr/>
+        <w:t xml:space="preserve">JSJ: BTAS: </w:t>
+      </w:r>
+      <w:r>
+        <w:rPr/>
+        <w:t xml:space="preserve">3 oktav a fjerdedel 5 oktav terts 4 oktav septim 5 oktav terts skilletegn </w:t>
+      </w:r>
+    </w:p>
+    <w:p>
+      <w:pPr>
+        <w:pStyle w:val="Normal"/>
+        <w:rPr/>
+      </w:pPr>
+      <w:r>
+        <w:rPr/>
+        <w:t>JSJ: Slag 4</w:t>
+      </w:r>
+    </w:p>
+    <w:p>
+      <w:pPr>
+        <w:pStyle w:val="Normal"/>
+        <w:rPr/>
+      </w:pPr>
+      <w:r>
+        <w:rPr/>
+        <w:t xml:space="preserve">JSJ: B: </w:t>
+      </w:r>
+      <w:r>
+        <w:rPr/>
+        <w:t>3 oktav ais fjerdedel</w:t>
+      </w:r>
+    </w:p>
+    <w:p>
+      <w:pPr>
+        <w:pStyle w:val="Normal"/>
+        <w:rPr/>
+      </w:pPr>
+      <w:r>
+        <w:rPr/>
+        <w:t xml:space="preserve">JSJ: T: </w:t>
+      </w:r>
+      <w:r>
+        <w:rPr/>
+        <w:t xml:space="preserve"> lille bistemme 5 oktav cis fjerdedel </w:t>
+      </w:r>
+    </w:p>
+    <w:p>
+      <w:pPr>
+        <w:pStyle w:val="Normal"/>
+        <w:rPr/>
+      </w:pPr>
+      <w:r>
+        <w:rPr/>
+        <w:t xml:space="preserve">JSJ: A: </w:t>
+      </w:r>
+      <w:r>
+        <w:rPr/>
+        <w:t>lille bistemme 4 oktav g fjerdedel</w:t>
+      </w:r>
+    </w:p>
+    <w:p>
+      <w:pPr>
+        <w:pStyle w:val="Normal"/>
+        <w:rPr/>
+      </w:pPr>
+      <w:r>
+        <w:rPr/>
+        <w:t xml:space="preserve">JSJ: S </w:t>
+      </w:r>
+      <w:r>
+        <w:rPr/>
+        <w:t xml:space="preserve"> lille bistemme 5 oktav d ottendedel legato stop cis ottendedel legato stop ny takt </w:t>
+      </w:r>
+    </w:p>
+    <w:p>
+      <w:pPr>
+        <w:pStyle w:val="Normal"/>
+        <w:rPr>
+          <w:color w:val="FF6600"/>
+        </w:rPr>
+      </w:pPr>
+      <w:r>
+        <w:rPr>
+          <w:color w:val="FF6600"/>
+        </w:rPr>
+        <w:t>JSJ: Skal der  vises skilletegn mellem takt 3 og takt 4 ?</w:t>
+      </w:r>
+      <w:r>
+        <w:br w:type="page"/>
+      </w:r>
+    </w:p>
+    <w:p>
+      <w:pPr>
+        <w:pStyle w:val="Normal"/>
+        <w:rPr>
+          <w:color w:val="FF6600"/>
+        </w:rPr>
+      </w:pPr>
+      <w:r>
+        <w:rPr>
+          <w:color w:val="FF6600"/>
+        </w:rPr>
       </w:r>
     </w:p>
     <w:p>
@@ -1749,6 +2290,15 @@
       </w:pPr>
       <w:r>
         <w:rPr/>
+      </w:r>
+    </w:p>
+    <w:p>
+      <w:pPr>
+        <w:pStyle w:val="Normal"/>
+        <w:rPr/>
+      </w:pPr>
+      <w:r>
+        <w:rPr/>
         <w:t xml:space="preserve">3 oktav b fjerdedel med kvint oktav og 5 oktav terts c ottendedel med kvart a ottendedel med 5 oktav terts c ottendedel med kvart sekst  og 5 oktav terts d fjerdedel med kvart sekst og 5 oktav terts c ottendedel med sekst oktav og kryds for 5 oktav terts c ottendedel med kvint a ottendedel med 5 oktav terts ny takt </w:t>
       </w:r>
     </w:p>
@@ -1774,10 +2324,15 @@
     <w:p>
       <w:pPr>
         <w:pStyle w:val="Normal"/>
-        <w:rPr/>
-      </w:pPr>
-      <w:r>
-        <w:rPr/>
+        <w:rPr>
+          <w:color w:val="FF6600"/>
+        </w:rPr>
+      </w:pPr>
+      <w:r>
+        <w:rPr>
+          <w:color w:val="FF6600"/>
+        </w:rPr>
+        <w:t>JSJ: Samme problem som i takt 6: Takten indeholder en septim, som vises seo em ottendedelsnode.</w:t>
       </w:r>
     </w:p>
     <w:p>
@@ -1793,11 +2348,147 @@
     <w:p>
       <w:pPr>
         <w:pStyle w:val="Normal"/>
-        <w:rPr/>
-      </w:pPr>
-      <w:r>
-        <w:rPr/>
-        <w:t xml:space="preserve">3 oktav b fjerdedel med kvint oktav bindebue 5 oktav terts cis ottendedel bindebue start med kvart bindebue start septim bindebue stop 5 oktav terts bindebue start cis ottendedel bindebue stop med kvart bindebue stop med sekst med 5 oktav terts bindebue stop d fjerdedel med kvart med sekst med 5 oktav terts cis ottendedel overbindebue start med sekst med legatobindebue start med oktav legatobindebue start kryds for 5 oktav terts overbindebue start cis ottendedel overbinding stop med kvint legato stop med septim legato stop 5 oktav terts overbinding stop ny takt </w:t>
+        <w:rPr>
+          <w:color w:val="FF6600"/>
+        </w:rPr>
+      </w:pPr>
+      <w:r>
+        <w:rPr>
+          <w:color w:val="FF6600"/>
+          <w:sz w:val="28"/>
+          <w:szCs w:val="28"/>
+        </w:rPr>
+        <w:t>JSJ: Det er en fejl</w:t>
+      </w:r>
+      <w:r>
+        <w:rPr>
+          <w:color w:val="FF6600"/>
+        </w:rPr>
+        <w:t xml:space="preserve"> at der mangler legatobue efter intervaltegn sor sopranen</w:t>
+      </w:r>
+    </w:p>
+    <w:p>
+      <w:pPr>
+        <w:pStyle w:val="Normal"/>
+        <w:rPr/>
+      </w:pPr>
+      <w:r>
+        <w:rPr>
+          <w:color w:val="FF6600"/>
+        </w:rPr>
+        <w:t>JSJ:</w:t>
+      </w:r>
+      <w:r>
+        <w:rPr/>
+        <w:t xml:space="preserve">  1: </w:t>
+      </w:r>
+      <w:r>
+        <w:rPr/>
+        <w:t>3 oktav b fjerdedel med kvint oktav bindebue 5 oktav terts</w:t>
+      </w:r>
+    </w:p>
+    <w:p>
+      <w:pPr>
+        <w:pStyle w:val="Normal"/>
+        <w:rPr/>
+      </w:pPr>
+      <w:r>
+        <w:rPr>
+          <w:color w:val="FF6600"/>
+        </w:rPr>
+        <w:t>JSJ :</w:t>
+      </w:r>
+      <w:r>
+        <w:rPr/>
+        <w:t xml:space="preserve"> 2:</w:t>
+      </w:r>
+      <w:r>
+        <w:rPr/>
+        <w:t xml:space="preserve"> cis ottendedel bindebue start med kvart bindebue start septim bindebue stop 5 oktav terts bindebue start</w:t>
+      </w:r>
+    </w:p>
+    <w:p>
+      <w:pPr>
+        <w:pStyle w:val="Normal"/>
+        <w:rPr/>
+      </w:pPr>
+      <w:r>
+        <w:rPr>
+          <w:color w:val="FF6600"/>
+        </w:rPr>
+        <w:t xml:space="preserve">JSJ: </w:t>
+      </w:r>
+      <w:r>
+        <w:rPr/>
+        <w:t xml:space="preserve">2og: </w:t>
+      </w:r>
+      <w:r>
+        <w:rPr/>
+        <w:t xml:space="preserve"> cis ottendedel bindebue stop med kvart bindebue stop med sekst med 5 oktav terts bindebue stop </w:t>
+      </w:r>
+      <w:r>
+        <w:rPr>
+          <w:color w:val="FF6600"/>
+        </w:rPr>
+        <w:t>JSJ: 3:</w:t>
+      </w:r>
+      <w:r>
+        <w:rPr/>
+        <w:t xml:space="preserve"> </w:t>
+      </w:r>
+      <w:r>
+        <w:rPr/>
+        <w:t>d fjerdedel med kvart med sekst med 5 oktav terts</w:t>
+      </w:r>
+    </w:p>
+    <w:p>
+      <w:pPr>
+        <w:pStyle w:val="Normal"/>
+        <w:rPr/>
+      </w:pPr>
+      <w:r>
+        <w:rPr>
+          <w:color w:val="FF6600"/>
+        </w:rPr>
+        <w:t>JSJ: 4:</w:t>
+      </w:r>
+      <w:r>
+        <w:rPr>
+          <w:color w:val="FF6600"/>
+        </w:rPr>
+        <w:t xml:space="preserve"> </w:t>
+      </w:r>
+      <w:r>
+        <w:rPr/>
+        <w:t>cis ottendedel overbindebue start med sekst med legatobindebue start med oktav legatobindebue start kryds for 5 oktav terts overbindebue start</w:t>
+      </w:r>
+    </w:p>
+    <w:p>
+      <w:pPr>
+        <w:pStyle w:val="Normal"/>
+        <w:rPr/>
+      </w:pPr>
+      <w:r>
+        <w:rPr>
+          <w:color w:val="FF6600"/>
+        </w:rPr>
+        <w:t xml:space="preserve">JSJ 4og: </w:t>
+      </w:r>
+      <w:r>
+        <w:rPr/>
+        <w:t xml:space="preserve"> cis ottendedel overbinding stop med kvint legato stop med septim legato stop 5 oktav terts overbinding stop ny takt </w:t>
+      </w:r>
+    </w:p>
+    <w:p>
+      <w:pPr>
+        <w:pStyle w:val="Normal"/>
+        <w:rPr/>
+      </w:pPr>
+      <w:r>
+        <w:rPr/>
+      </w:r>
+      <w:r>
+        <w:br w:type="page"/>
       </w:r>
     </w:p>
     <w:p>
@@ -2099,10 +2790,15 @@
     <w:p>
       <w:pPr>
         <w:pStyle w:val="Normal"/>
-        <w:rPr/>
-      </w:pPr>
-      <w:r>
-        <w:rPr/>
+        <w:rPr>
+          <w:color w:val="FF6600"/>
+        </w:rPr>
+      </w:pPr>
+      <w:r>
+        <w:rPr>
+          <w:color w:val="FF6600"/>
+        </w:rPr>
+        <w:t>JSJ: kb 461-34 er faktisk titlen, Der vises det samme i sort. Så det erOK.</w:t>
       </w:r>
     </w:p>
     <w:p>
@@ -2156,10 +2852,15 @@
     <w:p>
       <w:pPr>
         <w:pStyle w:val="Normal"/>
-        <w:rPr/>
-      </w:pPr>
-      <w:r>
-        <w:rPr/>
+        <w:rPr>
+          <w:color w:val="FF6600"/>
+        </w:rPr>
+      </w:pPr>
+      <w:r>
+        <w:rPr>
+          <w:color w:val="FF6600"/>
+        </w:rPr>
+        <w:t>JSJ Septimfejlen er erkendt og rettet i 3.4</w:t>
       </w:r>
     </w:p>
     <w:p>
@@ -2185,10 +2886,15 @@
     <w:p>
       <w:pPr>
         <w:pStyle w:val="Normal"/>
-        <w:rPr/>
-      </w:pPr>
-      <w:r>
-        <w:rPr/>
+        <w:rPr>
+          <w:color w:val="FF6600"/>
+        </w:rPr>
+      </w:pPr>
+      <w:r>
+        <w:rPr>
+          <w:color w:val="FF6600"/>
+        </w:rPr>
+        <w:t>JSJ: Du har helt ret: Takt 3 slag 2 Tenor vises af MuseScore som h med løst kryds men af nodelæserens detaljevisning som C med løst kryds. Det er er fejl. Jeg skriver den på todo listen som fejl 457, men vil ikke forsøge at rette den lige nu, hvor focus er på punktnoder. Der har osse vøret fejl omkring afspilning af h med kryds. Den endte en oktav for lavt, men det er rettet.</w:t>
       </w:r>
     </w:p>
     <w:p>
@@ -2243,10 +2949,31 @@
     <w:p>
       <w:pPr>
         <w:pStyle w:val="Normal"/>
-        <w:rPr/>
-      </w:pPr>
-      <w:r>
-        <w:rPr/>
+        <w:rPr>
+          <w:color w:val="FF6600"/>
+        </w:rPr>
+      </w:pPr>
+      <w:r>
+        <w:rPr>
+          <w:color w:val="FF6600"/>
+        </w:rPr>
+        <w:t>JSJ: Det betyder ”Usædvanlig taktstreg” og står i MusicXml filen. Gør ikke noget ved det lige nu</w:t>
+      </w:r>
+      <w:r>
+        <w:br w:type="page"/>
+      </w:r>
+    </w:p>
+    <w:p>
+      <w:pPr>
+        <w:pStyle w:val="Normal"/>
+        <w:rPr>
+          <w:color w:val="FF6600"/>
+        </w:rPr>
+      </w:pPr>
+      <w:r>
+        <w:rPr>
+          <w:color w:val="FF6600"/>
+        </w:rPr>
       </w:r>
     </w:p>
     <w:p>
@@ -4557,6 +5284,69 @@
       <w:rFonts w:cs="Wingdings"/>
     </w:rPr>
   </w:style>
+  <w:style w:type="character" w:styleId="ListLabel52">
+    <w:name w:val="ListLabel 52"/>
+    <w:qFormat/>
+    <w:rPr>
+      <w:rFonts w:cs="Symbol"/>
+    </w:rPr>
+  </w:style>
+  <w:style w:type="character" w:styleId="ListLabel53">
+    <w:name w:val="ListLabel 53"/>
+    <w:qFormat/>
+    <w:rPr>
+      <w:rFonts w:cs="Courier New"/>
+    </w:rPr>
+  </w:style>
+  <w:style w:type="character" w:styleId="ListLabel54">
+    <w:name w:val="ListLabel 54"/>
+    <w:qFormat/>
+    <w:rPr>
+      <w:rFonts w:cs="Wingdings"/>
+    </w:rPr>
+  </w:style>
+  <w:style w:type="character" w:styleId="ListLabel55">
+    <w:name w:val="ListLabel 55"/>
+    <w:qFormat/>
+    <w:rPr>
+      <w:rFonts w:cs="Symbol"/>
+    </w:rPr>
+  </w:style>
+  <w:style w:type="character" w:styleId="ListLabel56">
+    <w:name w:val="ListLabel 56"/>
+    <w:qFormat/>
+    <w:rPr>
+      <w:rFonts w:cs="Courier New"/>
+    </w:rPr>
+  </w:style>
+  <w:style w:type="character" w:styleId="ListLabel57">
+    <w:name w:val="ListLabel 57"/>
+    <w:qFormat/>
+    <w:rPr>
+      <w:rFonts w:cs="Wingdings"/>
+    </w:rPr>
+  </w:style>
+  <w:style w:type="character" w:styleId="ListLabel58">
+    <w:name w:val="ListLabel 58"/>
+    <w:qFormat/>
+    <w:rPr>
+      <w:rFonts w:cs="Symbol"/>
+    </w:rPr>
+  </w:style>
+  <w:style w:type="character" w:styleId="ListLabel59">
+    <w:name w:val="ListLabel 59"/>
+    <w:qFormat/>
+    <w:rPr>
+      <w:rFonts w:cs="Courier New"/>
+    </w:rPr>
+  </w:style>
+  <w:style w:type="character" w:styleId="ListLabel60">
+    <w:name w:val="ListLabel 60"/>
+    <w:qFormat/>
+    <w:rPr>
+      <w:rFonts w:cs="Wingdings"/>
+    </w:rPr>
+  </w:style>
   <w:style w:type="paragraph" w:styleId="Overskrift">
     <w:name w:val="Overskrift"/>
     <w:basedOn w:val="Normal"/>

</xml_diff>

<commit_message>
Avoid using "." in the caption
</commit_message>
<xml_diff>
--- a/Documentation/TEst reports/3.3/Test Ibos nodelæser 3 3 kommentarer Susanne.docx
+++ b/Documentation/TEst reports/3.3/Test Ibos nodelæser 3 3 kommentarer Susanne.docx
@@ -3103,6 +3103,43 @@
     <w:p>
       <w:pPr>
         <w:pStyle w:val="Normal"/>
+        <w:rPr>
+          <w:color w:val="FF6600"/>
+        </w:rPr>
+      </w:pPr>
+      <w:r>
+        <w:rPr>
+          <w:color w:val="FF6600"/>
+        </w:rPr>
+        <w:t>JSJ: Det er en fejl i version 3.3, som nu er rettet: Programmet checkede om én af stemmerne hed</w:t>
+      </w:r>
+    </w:p>
+    <w:p>
+      <w:pPr>
+        <w:pStyle w:val="Normal"/>
+        <w:rPr>
+          <w:color w:val="FF6600"/>
+        </w:rPr>
+      </w:pPr>
+      <w:r>
+        <w:rPr>
+          <w:color w:val="FF6600"/>
+        </w:rPr>
+        <w:t>”</w:t>
+      </w:r>
+      <w:r>
+        <w:rPr>
+          <w:color w:val="FF6600"/>
+        </w:rPr>
+        <w:t>SOPRANO”,  ”SOPAN” eller ”S” Altså SOPAN uden ”R”. Og dét gjorde den sjovt nok ikke !</w:t>
+      </w:r>
+      <w:r>
+        <w:br w:type="page"/>
+      </w:r>
+    </w:p>
+    <w:p>
+      <w:pPr>
+        <w:pStyle w:val="Normal"/>
         <w:rPr/>
       </w:pPr>
       <w:r>
@@ -3255,10 +3292,15 @@
     <w:p>
       <w:pPr>
         <w:pStyle w:val="Normal"/>
-        <w:rPr/>
-      </w:pPr>
-      <w:r>
-        <w:rPr/>
+        <w:rPr>
+          <w:color w:val="FF6600"/>
+        </w:rPr>
+      </w:pPr>
+      <w:r>
+        <w:rPr>
+          <w:color w:val="FF6600"/>
+        </w:rPr>
+        <w:t>JSJ: Du har ret. Der står (dot4+dot6). Og det gør der faktisk i alle enkeltstemmerne, men ikke i de kunstige stemmer SA BT og TUTTI. Det skyldes at der indgår et punktum i stemmenavnet og der er tilsyneladende vild forvirring omkring punktum i Braille i forskellige sprog. Jeg fjerner indtil videre punktummet, så der ikke står noget ulæseligt. Reported as error 458 and fixed.</w:t>
       </w:r>
     </w:p>
     <w:p>

</xml_diff>

<commit_message>
Updated comments and todo
</commit_message>
<xml_diff>
--- a/Documentation/TEst reports/3.3/Test Ibos nodelæser 3 3 kommentarer Susanne.docx
+++ b/Documentation/TEst reports/3.3/Test Ibos nodelæser 3 3 kommentarer Susanne.docx
@@ -1628,553 +1628,473 @@
       </w:r>
       <w:r>
         <w:rPr/>
+        <w:t xml:space="preserve"> Skilletegn 3 oktav fis fjerdedel gis fjerdedel </w:t>
+      </w:r>
+    </w:p>
+    <w:p>
+      <w:pPr>
+        <w:pStyle w:val="Normal"/>
+        <w:rPr/>
+      </w:pPr>
+      <w:r>
+        <w:rPr>
+          <w:color w:val="800000"/>
+        </w:rPr>
+        <w:t>JSJ: T:</w:t>
+      </w:r>
+      <w:r>
+        <w:rPr/>
+        <w:t xml:space="preserve"> lille bistemme 4 oktavk a fjerdedel b fjerdedel</w:t>
+      </w:r>
+    </w:p>
+    <w:p>
+      <w:pPr>
+        <w:pStyle w:val="Normal"/>
+        <w:rPr/>
+      </w:pPr>
+      <w:r>
+        <w:rPr>
+          <w:color w:val="800000"/>
+        </w:rPr>
+        <w:t>JSJ: A:</w:t>
+      </w:r>
+      <w:r>
+        <w:rPr/>
+        <w:t xml:space="preserve">  lille bistemme 4 oktav gis fjerdedel fis fjerdedel</w:t>
+      </w:r>
+    </w:p>
+    <w:p>
+      <w:pPr>
+        <w:pStyle w:val="Normal"/>
+        <w:rPr/>
+      </w:pPr>
+      <w:r>
+        <w:rPr/>
+        <w:t>JSJ: S:  lille bistemme 5 oktavk cis punkteret fjerdedel b ottendedel</w:t>
+      </w:r>
+    </w:p>
+    <w:p>
+      <w:pPr>
+        <w:pStyle w:val="Normal"/>
+        <w:rPr>
+          <w:color w:val="800000"/>
+        </w:rPr>
+      </w:pPr>
+      <w:r>
+        <w:rPr>
+          <w:color w:val="800000"/>
+        </w:rPr>
+        <w:t>JSJ: Her mangler tydeligvis et skilletegn ! Slag 3-4:</w:t>
+      </w:r>
+    </w:p>
+    <w:p>
+      <w:pPr>
+        <w:pStyle w:val="Normal"/>
+        <w:rPr/>
+      </w:pPr>
+      <w:r>
+        <w:rPr/>
+        <w:t xml:space="preserve">JSJ: B: 3 oktav a fjerdedel a ottendedel med 5 oktav terts 5 oktav terts skilletegn ais fjerdedel lille bistemme 5 oktavk cis fjerdedel lille bistemme opløsning 4 oktav g lille bistemme 5 oktav d ottendedel bindebue cis ottendedel bindebue </w:t>
+      </w:r>
+    </w:p>
+    <w:p>
+      <w:pPr>
+        <w:pStyle w:val="Normal"/>
+        <w:rPr/>
+      </w:pPr>
+      <w:r>
+        <w:rPr/>
+      </w:r>
+    </w:p>
+    <w:p>
+      <w:pPr>
+        <w:pStyle w:val="Normal"/>
+        <w:rPr/>
+      </w:pPr>
+      <w:r>
+        <w:rPr/>
+        <w:t xml:space="preserve">Det går galt på det sted i takten hvor der står 3 oktav a fjerdedel og herefter a ottendedel med 5 oktav terts to gange, det passer ikke med det antal noder, der skal være i takten. </w:t>
+      </w:r>
+    </w:p>
+    <w:p>
+      <w:pPr>
+        <w:pStyle w:val="Normal"/>
+        <w:rPr>
+          <w:color w:val="800000"/>
+        </w:rPr>
+      </w:pPr>
+      <w:r>
+        <w:rPr>
+          <w:color w:val="800000"/>
+        </w:rPr>
+        <w:t xml:space="preserve">JSJ: Det skyldes en kombination af 3 ting: </w:t>
+      </w:r>
+    </w:p>
+    <w:p>
+      <w:pPr>
+        <w:pStyle w:val="Normal"/>
+        <w:rPr>
+          <w:color w:val="800000"/>
+        </w:rPr>
+      </w:pPr>
+      <w:r>
+        <w:rPr>
+          <w:color w:val="800000"/>
+        </w:rPr>
+        <w:t>1: Tenoren er noteret en oktav for højt, derfor er tenorens cis højere end altens gis.</w:t>
+      </w:r>
+    </w:p>
+    <w:p>
+      <w:pPr>
+        <w:pStyle w:val="Normal"/>
+        <w:rPr>
+          <w:color w:val="800000"/>
+        </w:rPr>
+      </w:pPr>
+      <w:r>
+        <w:rPr>
+          <w:color w:val="800000"/>
+        </w:rPr>
+        <w:t>2: I intervalnotationen ordnes intervallerne pt efter frekvens, ikke (som de burde) efter stemme. Derfor ombyttes stemmerne ved stemmekryds. Så programmet forsøger at skrive:</w:t>
+      </w:r>
+    </w:p>
+    <w:p>
+      <w:pPr>
+        <w:pStyle w:val="Normal"/>
+        <w:rPr>
+          <w:color w:val="800000"/>
+        </w:rPr>
+      </w:pPr>
+      <w:r>
+        <w:rPr>
+          <w:color w:val="800000"/>
+        </w:rPr>
         <w:t xml:space="preserve"> </w:t>
       </w:r>
       <w:r>
-        <w:rPr/>
-        <w:t xml:space="preserve">Skilletegn 3 oktav fis fjerdedel gis fjerdedel </w:t>
-      </w:r>
-    </w:p>
-    <w:p>
-      <w:pPr>
-        <w:pStyle w:val="Normal"/>
-        <w:rPr/>
-      </w:pPr>
-      <w:r>
         <w:rPr>
           <w:color w:val="800000"/>
         </w:rPr>
-        <w:t>JSJ: T:</w:t>
-      </w:r>
+        <w:t>A fjerdedel, septim (altens) , terts (tenorens), terts (sopranens)</w:t>
+      </w:r>
+    </w:p>
+    <w:p>
+      <w:pPr>
+        <w:pStyle w:val="Normal"/>
+        <w:rPr>
+          <w:color w:val="800000"/>
+        </w:rPr>
+      </w:pPr>
+      <w:r>
+        <w:rPr>
+          <w:color w:val="800000"/>
+        </w:rPr>
+        <w:t>3: Septim skrives som omtalt i 3.3 fejlagtigt som (dot2 + dot4) = en ottendedelsnode.</w:t>
+      </w:r>
+    </w:p>
+    <w:p>
+      <w:pPr>
+        <w:pStyle w:val="Normal"/>
+        <w:rPr>
+          <w:color w:val="800000"/>
+        </w:rPr>
+      </w:pPr>
+      <w:r>
+        <w:rPr>
+          <w:color w:val="800000"/>
+        </w:rPr>
+        <w:t>Der er noget, der ikke stemmer helt her, for dot2+dot4 er ikke a.</w:t>
+      </w:r>
+    </w:p>
+    <w:p>
+      <w:pPr>
+        <w:pStyle w:val="Normal"/>
+        <w:rPr>
+          <w:color w:val="800000"/>
+        </w:rPr>
+      </w:pPr>
+      <w:r>
+        <w:rPr>
+          <w:color w:val="800000"/>
+        </w:rPr>
+        <w:t xml:space="preserve">Under alle omstændigheder viser 3.4 </w:t>
+      </w:r>
+    </w:p>
+    <w:p>
+      <w:pPr>
+        <w:pStyle w:val="Normal"/>
+        <w:rPr>
+          <w:color w:val="800000"/>
+        </w:rPr>
+      </w:pPr>
+      <w:r>
+        <w:rPr>
+          <w:color w:val="800000"/>
+        </w:rPr>
+        <w:t>a fjerdedel + septim + terts + terts</w:t>
+      </w:r>
+    </w:p>
+    <w:p>
+      <w:pPr>
+        <w:pStyle w:val="Normal"/>
+        <w:rPr>
+          <w:color w:val="800000"/>
+        </w:rPr>
+      </w:pPr>
+      <w:r>
+        <w:rPr>
+          <w:color w:val="800000"/>
+        </w:rPr>
+      </w:r>
+    </w:p>
+    <w:p>
+      <w:pPr>
+        <w:pStyle w:val="Normal"/>
+        <w:rPr>
+          <w:color w:val="800000"/>
+        </w:rPr>
+      </w:pPr>
+      <w:r>
+        <w:rPr>
+          <w:color w:val="800000"/>
+        </w:rPr>
+        <w:t>hvilket er korrekt bortset fra at man kan diskutere rækkefølgen af intervallerne.</w:t>
+      </w:r>
+    </w:p>
+    <w:p>
+      <w:pPr>
+        <w:pStyle w:val="Normal"/>
+        <w:rPr>
+          <w:color w:val="800000"/>
+        </w:rPr>
+      </w:pPr>
+      <w:r>
+        <w:rPr>
+          <w:color w:val="800000"/>
+        </w:rPr>
+        <w:t>Og selvfølgelig bured takt 6 skrives som stor bistemme i stedet for dette miskmask af</w:t>
+      </w:r>
+    </w:p>
+    <w:p>
+      <w:pPr>
+        <w:pStyle w:val="Normal"/>
+        <w:rPr>
+          <w:color w:val="800000"/>
+        </w:rPr>
+      </w:pPr>
+      <w:r>
+        <w:rPr>
+          <w:color w:val="800000"/>
+        </w:rPr>
+        <w:t>lille bistemme i slag 1+2 + intervalnotation i slag 3  + lille bistemme i slag 4</w:t>
+      </w:r>
+    </w:p>
+    <w:p>
+      <w:pPr>
+        <w:pStyle w:val="Normal"/>
+        <w:rPr/>
+      </w:pPr>
+      <w:r>
+        <w:rPr/>
+      </w:r>
+    </w:p>
+    <w:p>
+      <w:pPr>
+        <w:pStyle w:val="Normal"/>
+        <w:rPr/>
+      </w:pPr>
+      <w:r>
+        <w:rPr/>
+        <w:t xml:space="preserve">Helst ville jeg af plads og forståelseshensyn skrive takt 6.0 sådan (altid oktavtegn i den ny takt efter forudgående takt med bistemme i): </w:t>
+      </w:r>
+    </w:p>
+    <w:p>
+      <w:pPr>
+        <w:pStyle w:val="Normal"/>
+        <w:rPr/>
+      </w:pPr>
+      <w:r>
+        <w:rPr/>
+        <w:t xml:space="preserve">Sopran og alt: </w:t>
+      </w:r>
+    </w:p>
+    <w:p>
+      <w:pPr>
+        <w:pStyle w:val="Normal"/>
+        <w:rPr/>
+      </w:pPr>
+      <w:r>
+        <w:rPr>
+          <w:color w:val="800000"/>
+        </w:rPr>
+        <w:t>JSJ: S:</w:t>
+      </w:r>
+      <w:r>
+        <w:rPr/>
+        <w:t xml:space="preserve"> 5 oktav punkteret cis fjerdedel b ottendedel cis fjerdedel d ottendedel legato stop cis ottendedel legato stop </w:t>
+      </w:r>
+    </w:p>
+    <w:p>
+      <w:pPr>
+        <w:pStyle w:val="Normal"/>
+        <w:rPr/>
+      </w:pPr>
+      <w:r>
+        <w:rPr>
+          <w:color w:val="800000"/>
+        </w:rPr>
+        <w:t xml:space="preserve">JSJ: A: </w:t>
+      </w:r>
+      <w:r>
+        <w:rPr/>
+        <w:t xml:space="preserve">stor bistemme 4 oktav gis fjerdedel fis fjerdedel gis fjerdedel opløsning g fjerdedel ny takt </w:t>
+      </w:r>
+    </w:p>
+    <w:p>
+      <w:pPr>
+        <w:pStyle w:val="Normal"/>
+        <w:rPr/>
+      </w:pPr>
+      <w:r>
+        <w:rPr/>
+        <w:t>Bas og tenor:</w:t>
+      </w:r>
+    </w:p>
+    <w:p>
+      <w:pPr>
+        <w:pStyle w:val="Normal"/>
+        <w:rPr/>
+      </w:pPr>
+      <w:r>
+        <w:rPr>
+          <w:color w:val="FF6600"/>
+        </w:rPr>
+        <w:t>JSJ: B+T:</w:t>
+      </w:r>
+      <w:r>
+        <w:rPr/>
+        <w:t xml:space="preserve"> 3 oktav fis fjerdedel med 4 oktav terts gis fjerdedel med 4 oktav terts a fjerdedel med 5 oktav terts ais fjerdedel med 5 oktav terts ny takt </w:t>
+      </w:r>
+    </w:p>
+    <w:p>
+      <w:pPr>
+        <w:pStyle w:val="Normal"/>
+        <w:rPr>
+          <w:color w:val="FF6600"/>
+        </w:rPr>
+      </w:pPr>
+      <w:r>
+        <w:rPr>
+          <w:color w:val="FF6600"/>
+        </w:rPr>
+        <w:t>JSJ: Helt enig, hvis vi taler om separate SA + BT, men hvis vi taler TUTTI er man vel nødt til at anvende stor bistemme gennemgående ?</w:t>
+      </w:r>
+    </w:p>
+    <w:p>
+      <w:pPr>
+        <w:pStyle w:val="Normal"/>
+        <w:rPr/>
+      </w:pPr>
+      <w:r>
+        <w:rPr/>
+      </w:r>
+    </w:p>
+    <w:p>
+      <w:pPr>
+        <w:pStyle w:val="Normal"/>
+        <w:rPr/>
+      </w:pPr>
+      <w:r>
+        <w:rPr/>
+        <w:t xml:space="preserve">Alternativt ville jeg skrive takt 6.0 sådan: </w:t>
+      </w:r>
+    </w:p>
+    <w:p>
+      <w:pPr>
+        <w:pStyle w:val="Normal"/>
+        <w:rPr/>
+      </w:pPr>
+      <w:r>
+        <w:rPr/>
+        <w:t>Ingen skilletegn i starten af takten</w:t>
+      </w:r>
+    </w:p>
+    <w:p>
+      <w:pPr>
+        <w:pStyle w:val="Normal"/>
+        <w:rPr>
+          <w:color w:val="FF6600"/>
+        </w:rPr>
+      </w:pPr>
+      <w:r>
+        <w:rPr>
+          <w:color w:val="FF6600"/>
+        </w:rPr>
+        <w:t>JSJ: Slag 1-2</w:t>
+      </w:r>
+    </w:p>
+    <w:p>
+      <w:pPr>
+        <w:pStyle w:val="Normal"/>
+        <w:rPr/>
+      </w:pPr>
+      <w:r>
+        <w:rPr/>
+        <w:t xml:space="preserve">JSJ: B:  3 oktav fis fjerdedel gis fjerdedel </w:t>
+      </w:r>
+    </w:p>
+    <w:p>
+      <w:pPr>
+        <w:pStyle w:val="Normal"/>
+        <w:rPr/>
+      </w:pPr>
+      <w:r>
+        <w:rPr/>
+        <w:t>JSJ: T: lille bistemme 4 oktav a fjerdedel b fjerdedel</w:t>
+      </w:r>
+    </w:p>
+    <w:p>
+      <w:pPr>
+        <w:pStyle w:val="Normal"/>
+        <w:rPr/>
+      </w:pPr>
+      <w:r>
+        <w:rPr/>
+        <w:t>JSJ: A: lille bistemme 4 oktav gis fjerdedel fis fjerdedel</w:t>
+      </w:r>
+    </w:p>
+    <w:p>
+      <w:pPr>
+        <w:pStyle w:val="Normal"/>
+        <w:rPr/>
+      </w:pPr>
+      <w:r>
+        <w:rPr/>
+        <w:t>JSJ: S:  lille bistemme 5 oktav punkteret cis fjerdedel b ottendedel skilletegn</w:t>
+      </w:r>
+    </w:p>
+    <w:p>
+      <w:pPr>
+        <w:pStyle w:val="Normal"/>
+        <w:rPr/>
+      </w:pPr>
+      <w:r>
+        <w:rPr/>
+        <w:t>JSJ: Slag 3</w:t>
+      </w:r>
+    </w:p>
+    <w:p>
+      <w:pPr>
+        <w:pStyle w:val="Normal"/>
+        <w:rPr/>
+      </w:pPr>
       <w:r>
         <w:rPr/>
         <w:t xml:space="preserve"> </w:t>
       </w:r>
       <w:r>
         <w:rPr/>
-        <w:t>lille bistemme 4 oktavk a fjerdedel b fjerdedel</w:t>
-      </w:r>
-    </w:p>
-    <w:p>
-      <w:pPr>
-        <w:pStyle w:val="Normal"/>
-        <w:rPr/>
-      </w:pPr>
-      <w:r>
-        <w:rPr>
-          <w:color w:val="800000"/>
-        </w:rPr>
-        <w:t>JSJ: A:</w:t>
-      </w:r>
-      <w:r>
-        <w:rPr/>
-        <w:t xml:space="preserve"> </w:t>
-      </w:r>
-      <w:r>
-        <w:rPr/>
-        <w:t xml:space="preserve"> lille bistemme 4 oktav gis fjerdedel fis fjerdedel</w:t>
-      </w:r>
-    </w:p>
-    <w:p>
-      <w:pPr>
-        <w:pStyle w:val="Normal"/>
-        <w:rPr/>
-      </w:pPr>
-      <w:r>
-        <w:rPr/>
-        <w:t xml:space="preserve">JSJ: S: </w:t>
-      </w:r>
-      <w:r>
-        <w:rPr/>
-        <w:t xml:space="preserve"> lille bistemme 5 oktavk cis punkteret fjerdedel b ottendedel</w:t>
-      </w:r>
-    </w:p>
-    <w:p>
-      <w:pPr>
-        <w:pStyle w:val="Normal"/>
-        <w:rPr>
-          <w:color w:val="800000"/>
-        </w:rPr>
-      </w:pPr>
-      <w:r>
-        <w:rPr>
-          <w:color w:val="800000"/>
-        </w:rPr>
-        <w:t>JSJ: Her mangler tydeligvis et skilletegn ! Slag 3-4:</w:t>
-      </w:r>
-    </w:p>
-    <w:p>
-      <w:pPr>
-        <w:pStyle w:val="Normal"/>
-        <w:rPr/>
-      </w:pPr>
-      <w:r>
-        <w:rPr/>
-        <w:t>JSJ: B:</w:t>
-      </w:r>
-      <w:r>
-        <w:rPr/>
-        <w:t xml:space="preserve"> 3 oktav a fjerdedel a ottendedel med 5 oktav terts 5 oktav terts skilletegn ais fjerdedel lille bistemme 5 oktavk cis fjerdedel lille bistemme opløsning 4 oktav g lille bistemme 5 oktav d ottendedel bindebue cis ottendedel bindebue </w:t>
-      </w:r>
-    </w:p>
-    <w:p>
-      <w:pPr>
-        <w:pStyle w:val="Normal"/>
-        <w:rPr/>
-      </w:pPr>
-      <w:r>
-        <w:rPr/>
-      </w:r>
-    </w:p>
-    <w:p>
-      <w:pPr>
-        <w:pStyle w:val="Normal"/>
-        <w:rPr/>
-      </w:pPr>
-      <w:r>
-        <w:rPr/>
-        <w:t xml:space="preserve">Det går galt på det sted i takten hvor der står 3 oktav a fjerdedel og herefter a ottendedel med 5 oktav terts to gange, det passer ikke med det antal noder, der skal være i takten. </w:t>
-      </w:r>
-    </w:p>
-    <w:p>
-      <w:pPr>
-        <w:pStyle w:val="Normal"/>
-        <w:rPr>
-          <w:color w:val="800000"/>
-        </w:rPr>
-      </w:pPr>
-      <w:r>
-        <w:rPr>
-          <w:color w:val="800000"/>
-        </w:rPr>
-        <w:t xml:space="preserve">JSJ: Det skyldes en kombination af 3 ting: </w:t>
-      </w:r>
-    </w:p>
-    <w:p>
-      <w:pPr>
-        <w:pStyle w:val="Normal"/>
-        <w:rPr>
-          <w:color w:val="800000"/>
-        </w:rPr>
-      </w:pPr>
-      <w:r>
-        <w:rPr>
-          <w:color w:val="800000"/>
-        </w:rPr>
-        <w:t>1: Tenoren er noteret en oktav for højt, derfor er tenorens cis højere end altens gis.</w:t>
-      </w:r>
-    </w:p>
-    <w:p>
-      <w:pPr>
-        <w:pStyle w:val="Normal"/>
-        <w:rPr>
-          <w:color w:val="800000"/>
-        </w:rPr>
-      </w:pPr>
-      <w:r>
-        <w:rPr>
-          <w:color w:val="800000"/>
-        </w:rPr>
-        <w:t>2: I intervalnotationen ordnes intervallerne pt efter frekvens, ikke (som de burde) efter stemme. Derfor ombyttes stemmerne ved stemmekryds. Så programmet forsøger at skrive:</w:t>
-      </w:r>
-    </w:p>
-    <w:p>
-      <w:pPr>
-        <w:pStyle w:val="Normal"/>
-        <w:rPr>
-          <w:color w:val="800000"/>
-        </w:rPr>
-      </w:pPr>
-      <w:r>
-        <w:rPr>
-          <w:color w:val="800000"/>
-        </w:rPr>
-        <w:t xml:space="preserve"> </w:t>
-      </w:r>
-      <w:r>
-        <w:rPr>
-          <w:color w:val="800000"/>
-        </w:rPr>
-        <w:t>A</w:t>
-      </w:r>
-      <w:r>
-        <w:rPr>
-          <w:color w:val="800000"/>
-        </w:rPr>
-        <w:t xml:space="preserve"> fjerdede</w:t>
-      </w:r>
-      <w:r>
-        <w:rPr>
-          <w:color w:val="800000"/>
-        </w:rPr>
-        <w:t>l</w:t>
-      </w:r>
-      <w:r>
-        <w:rPr>
-          <w:color w:val="800000"/>
-        </w:rPr>
-        <w:t xml:space="preserve">, </w:t>
-      </w:r>
-      <w:r>
-        <w:rPr>
-          <w:color w:val="800000"/>
-        </w:rPr>
-        <w:t>septim (altens)</w:t>
-      </w:r>
-      <w:r>
-        <w:rPr>
-          <w:color w:val="800000"/>
-        </w:rPr>
-        <w:t xml:space="preserve"> , </w:t>
-      </w:r>
-      <w:r>
-        <w:rPr>
-          <w:color w:val="800000"/>
-        </w:rPr>
-        <w:t>terts (tenorens), terts (sopranens)</w:t>
-      </w:r>
-    </w:p>
-    <w:p>
-      <w:pPr>
-        <w:pStyle w:val="Normal"/>
-        <w:rPr>
-          <w:color w:val="800000"/>
-        </w:rPr>
-      </w:pPr>
-      <w:r>
-        <w:rPr>
-          <w:color w:val="800000"/>
-        </w:rPr>
-        <w:t>3: Septim skrives som omtalt i 3.3 fejlagtigt som (dot2 + dot4) = en ottendedelsnode.</w:t>
-      </w:r>
-    </w:p>
-    <w:p>
-      <w:pPr>
-        <w:pStyle w:val="Normal"/>
-        <w:rPr>
-          <w:color w:val="800000"/>
-        </w:rPr>
-      </w:pPr>
-      <w:r>
-        <w:rPr>
-          <w:color w:val="800000"/>
-        </w:rPr>
-        <w:t>Der er noget, der ikke stemmer helt her, for dot2+dot4 er ikke a.</w:t>
-      </w:r>
-    </w:p>
-    <w:p>
-      <w:pPr>
-        <w:pStyle w:val="Normal"/>
-        <w:rPr>
-          <w:color w:val="800000"/>
-        </w:rPr>
-      </w:pPr>
-      <w:r>
-        <w:rPr>
-          <w:color w:val="800000"/>
-        </w:rPr>
-        <w:t xml:space="preserve">Under alle omstændigheder viser 3.4 </w:t>
-      </w:r>
-    </w:p>
-    <w:p>
-      <w:pPr>
-        <w:pStyle w:val="Normal"/>
-        <w:rPr>
-          <w:color w:val="800000"/>
-        </w:rPr>
-      </w:pPr>
-      <w:r>
-        <w:rPr>
-          <w:color w:val="800000"/>
-        </w:rPr>
-        <w:t>a fjerdedel + septim + terts + terts</w:t>
-      </w:r>
-    </w:p>
-    <w:p>
-      <w:pPr>
-        <w:pStyle w:val="Normal"/>
-        <w:rPr>
-          <w:color w:val="800000"/>
-        </w:rPr>
-      </w:pPr>
-      <w:r>
-        <w:rPr>
-          <w:color w:val="800000"/>
-        </w:rPr>
-      </w:r>
-    </w:p>
-    <w:p>
-      <w:pPr>
-        <w:pStyle w:val="Normal"/>
-        <w:rPr>
-          <w:color w:val="800000"/>
-        </w:rPr>
-      </w:pPr>
-      <w:r>
-        <w:rPr>
-          <w:color w:val="800000"/>
-        </w:rPr>
-        <w:t>hvilket er korrekt bortset fra at man kan diskutere rækkefølgen af intervallerne.</w:t>
-      </w:r>
-    </w:p>
-    <w:p>
-      <w:pPr>
-        <w:pStyle w:val="Normal"/>
-        <w:rPr>
-          <w:color w:val="800000"/>
-        </w:rPr>
-      </w:pPr>
-      <w:r>
-        <w:rPr>
-          <w:color w:val="800000"/>
-        </w:rPr>
-        <w:t>Og selvfølgelig bured takt 6 skrives som stor bistemme i stedet for dette miskmask af</w:t>
-      </w:r>
-    </w:p>
-    <w:p>
-      <w:pPr>
-        <w:pStyle w:val="Normal"/>
-        <w:rPr>
-          <w:color w:val="800000"/>
-        </w:rPr>
-      </w:pPr>
-      <w:r>
-        <w:rPr>
-          <w:color w:val="800000"/>
-        </w:rPr>
-        <w:t>lille bistemme i slag 1+2 + intervalnotation i slag 3  + lille bistemme i slag 4</w:t>
-      </w:r>
-    </w:p>
-    <w:p>
-      <w:pPr>
-        <w:pStyle w:val="Normal"/>
-        <w:rPr/>
-      </w:pPr>
-      <w:r>
-        <w:rPr/>
-      </w:r>
-    </w:p>
-    <w:p>
-      <w:pPr>
-        <w:pStyle w:val="Normal"/>
-        <w:rPr/>
-      </w:pPr>
-      <w:r>
-        <w:rPr/>
-        <w:t xml:space="preserve">Helst ville jeg af plads og forståelseshensyn skrive takt 6.0 sådan (altid oktavtegn i den ny takt efter forudgående takt med bistemme i): </w:t>
-      </w:r>
-    </w:p>
-    <w:p>
-      <w:pPr>
-        <w:pStyle w:val="Normal"/>
-        <w:rPr/>
-      </w:pPr>
-      <w:r>
-        <w:rPr/>
-        <w:t xml:space="preserve">Sopran og alt: </w:t>
-      </w:r>
-    </w:p>
-    <w:p>
-      <w:pPr>
-        <w:pStyle w:val="Normal"/>
-        <w:rPr/>
-      </w:pPr>
-      <w:r>
-        <w:rPr>
-          <w:color w:val="800000"/>
-        </w:rPr>
-        <w:t>JSJ: S:</w:t>
-      </w:r>
-      <w:r>
-        <w:rPr/>
-        <w:t xml:space="preserve"> </w:t>
-      </w:r>
-      <w:r>
-        <w:rPr/>
-        <w:t xml:space="preserve">5 oktav punkteret cis fjerdedel b ottendedel cis fjerdedel d ottendedel legato stop cis ottendedel legato stop </w:t>
-      </w:r>
-    </w:p>
-    <w:p>
-      <w:pPr>
-        <w:pStyle w:val="Normal"/>
-        <w:rPr/>
-      </w:pPr>
-      <w:r>
-        <w:rPr>
-          <w:color w:val="800000"/>
-        </w:rPr>
-        <w:t xml:space="preserve">JSJ: A: </w:t>
-      </w:r>
-      <w:r>
-        <w:rPr/>
-        <w:t xml:space="preserve">stor bistemme 4 oktav gis fjerdedel fis fjerdedel gis fjerdedel opløsning g fjerdedel ny takt </w:t>
-      </w:r>
-    </w:p>
-    <w:p>
-      <w:pPr>
-        <w:pStyle w:val="Normal"/>
-        <w:rPr/>
-      </w:pPr>
-      <w:r>
-        <w:rPr/>
-        <w:t>Bas og tenor:</w:t>
-      </w:r>
-    </w:p>
-    <w:p>
-      <w:pPr>
-        <w:pStyle w:val="Normal"/>
-        <w:rPr/>
-      </w:pPr>
-      <w:r>
-        <w:rPr>
-          <w:color w:val="FF6600"/>
-        </w:rPr>
-        <w:t>JSJ: B+T:</w:t>
-      </w:r>
-      <w:r>
-        <w:rPr/>
-        <w:t xml:space="preserve"> 3 oktav fis fjerdedel med 4 oktav terts gis fjerdedel med 4 oktav terts a fjerdedel med 5 oktav terts ais fjerdedel med 5 oktav terts ny takt </w:t>
-      </w:r>
-    </w:p>
-    <w:p>
-      <w:pPr>
-        <w:pStyle w:val="Normal"/>
-        <w:rPr>
-          <w:color w:val="FF6600"/>
-        </w:rPr>
-      </w:pPr>
-      <w:r>
-        <w:rPr>
-          <w:color w:val="FF6600"/>
-        </w:rPr>
-        <w:t>JSJ: Helt enig, hvis vi taler om separate SA + BT, men hvis vi taler TUTTI er man vel nødt til at anvende stor bistemme gennemgående ?</w:t>
-      </w:r>
-    </w:p>
-    <w:p>
-      <w:pPr>
-        <w:pStyle w:val="Normal"/>
-        <w:rPr/>
-      </w:pPr>
-      <w:r>
-        <w:rPr/>
-      </w:r>
-    </w:p>
-    <w:p>
-      <w:pPr>
-        <w:pStyle w:val="Normal"/>
-        <w:rPr/>
-      </w:pPr>
-      <w:r>
-        <w:rPr/>
-        <w:t xml:space="preserve">Alternativt ville jeg skrive takt 6.0 sådan: </w:t>
-      </w:r>
-    </w:p>
-    <w:p>
-      <w:pPr>
-        <w:pStyle w:val="Normal"/>
-        <w:rPr/>
-      </w:pPr>
-      <w:r>
-        <w:rPr/>
-        <w:t>Ingen skilletegn i starten af takten</w:t>
-      </w:r>
-    </w:p>
-    <w:p>
-      <w:pPr>
-        <w:pStyle w:val="Normal"/>
-        <w:rPr>
-          <w:color w:val="FF6600"/>
-        </w:rPr>
-      </w:pPr>
-      <w:r>
-        <w:rPr>
-          <w:color w:val="FF6600"/>
-        </w:rPr>
-        <w:t>JSJ: Slag 1-2</w:t>
-      </w:r>
-    </w:p>
-    <w:p>
-      <w:pPr>
-        <w:pStyle w:val="Normal"/>
-        <w:rPr/>
-      </w:pPr>
-      <w:r>
-        <w:rPr/>
-        <w:t xml:space="preserve">JSJ: B: </w:t>
-      </w:r>
-      <w:r>
-        <w:rPr/>
-        <w:t xml:space="preserve"> 3 oktav fis fjerdedel gis fjerdedel </w:t>
-      </w:r>
-    </w:p>
-    <w:p>
-      <w:pPr>
-        <w:pStyle w:val="Normal"/>
-        <w:rPr/>
-      </w:pPr>
-      <w:r>
-        <w:rPr/>
-        <w:t xml:space="preserve">JSJ: T: </w:t>
-      </w:r>
-      <w:r>
-        <w:rPr/>
-        <w:t>lille bistemme 4 oktav a fjerdedel b fjerdedel</w:t>
-      </w:r>
-    </w:p>
-    <w:p>
-      <w:pPr>
-        <w:pStyle w:val="Normal"/>
-        <w:rPr/>
-      </w:pPr>
-      <w:r>
-        <w:rPr/>
-        <w:t>JSJ: A:</w:t>
-      </w:r>
-      <w:r>
-        <w:rPr/>
-        <w:t xml:space="preserve"> lille bistemme 4 oktav gis fjerdedel fis fjerdedel</w:t>
-      </w:r>
-    </w:p>
-    <w:p>
-      <w:pPr>
-        <w:pStyle w:val="Normal"/>
-        <w:rPr/>
-      </w:pPr>
-      <w:r>
-        <w:rPr/>
-        <w:t xml:space="preserve">JSJ: S: </w:t>
-      </w:r>
-      <w:r>
-        <w:rPr/>
-        <w:t xml:space="preserve"> lille bistemme 5 oktav punkteret cis fjerdedel b ottendedel skilletegn</w:t>
-      </w:r>
-    </w:p>
-    <w:p>
-      <w:pPr>
-        <w:pStyle w:val="Normal"/>
-        <w:rPr/>
-      </w:pPr>
-      <w:r>
-        <w:rPr/>
-        <w:t>JSJ: Slag 3</w:t>
-      </w:r>
-    </w:p>
-    <w:p>
-      <w:pPr>
-        <w:pStyle w:val="Normal"/>
-        <w:rPr/>
-      </w:pPr>
-      <w:r>
-        <w:rPr/>
-        <w:t xml:space="preserve"> </w:t>
-      </w:r>
-      <w:r>
-        <w:rPr/>
-        <w:t xml:space="preserve">JSJ: BTAS: </w:t>
-      </w:r>
-      <w:r>
-        <w:rPr/>
-        <w:t xml:space="preserve">3 oktav a fjerdedel 5 oktav terts 4 oktav septim 5 oktav terts skilletegn </w:t>
+        <w:t xml:space="preserve">JSJ: BTAS: 3 oktav a fjerdedel 5 oktav terts 4 oktav septim 5 oktav terts skilletegn </w:t>
       </w:r>
     </w:p>
     <w:p>
@@ -2194,53 +2114,37 @@
       </w:pPr>
       <w:r>
         <w:rPr/>
-        <w:t xml:space="preserve">JSJ: B: </w:t>
-      </w:r>
-      <w:r>
-        <w:rPr/>
-        <w:t>3 oktav ais fjerdedel</w:t>
-      </w:r>
-    </w:p>
-    <w:p>
-      <w:pPr>
-        <w:pStyle w:val="Normal"/>
-        <w:rPr/>
-      </w:pPr>
-      <w:r>
-        <w:rPr/>
-        <w:t xml:space="preserve">JSJ: T: </w:t>
-      </w:r>
-      <w:r>
-        <w:rPr/>
-        <w:t xml:space="preserve"> lille bistemme 5 oktav cis fjerdedel </w:t>
-      </w:r>
-    </w:p>
-    <w:p>
-      <w:pPr>
-        <w:pStyle w:val="Normal"/>
-        <w:rPr/>
-      </w:pPr>
-      <w:r>
-        <w:rPr/>
-        <w:t xml:space="preserve">JSJ: A: </w:t>
-      </w:r>
-      <w:r>
-        <w:rPr/>
-        <w:t>lille bistemme 4 oktav g fjerdedel</w:t>
-      </w:r>
-    </w:p>
-    <w:p>
-      <w:pPr>
-        <w:pStyle w:val="Normal"/>
-        <w:rPr/>
-      </w:pPr>
-      <w:r>
-        <w:rPr/>
-        <w:t xml:space="preserve">JSJ: S </w:t>
-      </w:r>
-      <w:r>
-        <w:rPr/>
-        <w:t xml:space="preserve"> lille bistemme 5 oktav d ottendedel legato stop cis ottendedel legato stop ny takt </w:t>
+        <w:t>JSJ: B: 3 oktav ais fjerdedel</w:t>
+      </w:r>
+    </w:p>
+    <w:p>
+      <w:pPr>
+        <w:pStyle w:val="Normal"/>
+        <w:rPr/>
+      </w:pPr>
+      <w:r>
+        <w:rPr/>
+        <w:t xml:space="preserve">JSJ: T:  lille bistemme 5 oktav cis fjerdedel </w:t>
+      </w:r>
+    </w:p>
+    <w:p>
+      <w:pPr>
+        <w:pStyle w:val="Normal"/>
+        <w:rPr/>
+      </w:pPr>
+      <w:r>
+        <w:rPr/>
+        <w:t>JSJ: A: lille bistemme 4 oktav g fjerdedel</w:t>
+      </w:r>
+    </w:p>
+    <w:p>
+      <w:pPr>
+        <w:pStyle w:val="Normal"/>
+        <w:rPr/>
+      </w:pPr>
+      <w:r>
+        <w:rPr/>
+        <w:t xml:space="preserve">JSJ: S  lille bistemme 5 oktav d ottendedel legato stop cis ottendedel legato stop ny takt </w:t>
       </w:r>
     </w:p>
     <w:p>
@@ -2380,11 +2284,7 @@
       </w:r>
       <w:r>
         <w:rPr/>
-        <w:t xml:space="preserve">  1: </w:t>
-      </w:r>
-      <w:r>
-        <w:rPr/>
-        <w:t>3 oktav b fjerdedel med kvint oktav bindebue 5 oktav terts</w:t>
+        <w:t xml:space="preserve">  1: 3 oktav b fjerdedel med kvint oktav bindebue 5 oktav terts</w:t>
       </w:r>
     </w:p>
     <w:p>
@@ -2400,11 +2300,7 @@
       </w:r>
       <w:r>
         <w:rPr/>
-        <w:t xml:space="preserve"> 2:</w:t>
-      </w:r>
-      <w:r>
-        <w:rPr/>
-        <w:t xml:space="preserve"> cis ottendedel bindebue start med kvart bindebue start septim bindebue stop 5 oktav terts bindebue start</w:t>
+        <w:t xml:space="preserve"> 2: cis ottendedel bindebue start med kvart bindebue start septim bindebue stop 5 oktav terts bindebue start</w:t>
       </w:r>
     </w:p>
     <w:p>
@@ -2420,11 +2316,7 @@
       </w:r>
       <w:r>
         <w:rPr/>
-        <w:t xml:space="preserve">2og: </w:t>
-      </w:r>
-      <w:r>
-        <w:rPr/>
-        <w:t xml:space="preserve"> cis ottendedel bindebue stop med kvart bindebue stop med sekst med 5 oktav terts bindebue stop </w:t>
+        <w:t xml:space="preserve">2og:  cis ottendedel bindebue stop med kvart bindebue stop med sekst med 5 oktav terts bindebue stop </w:t>
       </w:r>
       <w:r>
         <w:rPr>
@@ -2434,29 +2326,19 @@
       </w:r>
       <w:r>
         <w:rPr/>
-        <w:t xml:space="preserve"> </w:t>
-      </w:r>
-      <w:r>
-        <w:rPr/>
-        <w:t>d fjerdedel med kvart med sekst med 5 oktav terts</w:t>
-      </w:r>
-    </w:p>
-    <w:p>
-      <w:pPr>
-        <w:pStyle w:val="Normal"/>
-        <w:rPr/>
-      </w:pPr>
-      <w:r>
-        <w:rPr>
-          <w:color w:val="FF6600"/>
-        </w:rPr>
-        <w:t>JSJ: 4:</w:t>
-      </w:r>
-      <w:r>
-        <w:rPr>
-          <w:color w:val="FF6600"/>
-        </w:rPr>
-        <w:t xml:space="preserve"> </w:t>
+        <w:t xml:space="preserve"> d fjerdedel med kvart med sekst med 5 oktav terts</w:t>
+      </w:r>
+    </w:p>
+    <w:p>
+      <w:pPr>
+        <w:pStyle w:val="Normal"/>
+        <w:rPr/>
+      </w:pPr>
+      <w:r>
+        <w:rPr>
+          <w:color w:val="FF6600"/>
+        </w:rPr>
+        <w:t xml:space="preserve">JSJ: 4: </w:t>
       </w:r>
       <w:r>
         <w:rPr/>
@@ -3315,15 +3197,6 @@
     </w:p>
     <w:p>
       <w:pPr>
-        <w:pStyle w:val="Normal"/>
-        <w:rPr/>
-      </w:pPr>
-      <w:r>
-        <w:rPr/>
-      </w:r>
-    </w:p>
-    <w:p>
-      <w:pPr>
         <w:pStyle w:val="Overskrift3"/>
         <w:rPr/>
       </w:pPr>
@@ -3379,6 +3252,29 @@
       <w:r>
         <w:rPr/>
         <w:t xml:space="preserve">Skulle det laves linje for linje, så ville jeg lade noderne stå øverst svarende til tekst: da blomstred roser frem mellem torne og så lave en ny linje over linje til tekst kyri eleison . Men tekst skal markeres med teksttegn (pkt 56 og i næste skriverum pkt 23)for hver tekstlinje og noder med nodetegn  (pkt 3 og i næste skriverum pkt6) for hver nodelinje efterfulgt altid af oktavtegn. </w:t>
+      </w:r>
+    </w:p>
+    <w:p>
+      <w:pPr>
+        <w:pStyle w:val="Normal"/>
+        <w:rPr>
+          <w:color w:val="FF6600"/>
+        </w:rPr>
+      </w:pPr>
+      <w:r>
+        <w:rPr>
+          <w:color w:val="FF6600"/>
+        </w:rPr>
+        <w:t>JSJ: Enoplagt idé til at søge ompenge til i version 5</w:t>
+      </w:r>
+    </w:p>
+    <w:p>
+      <w:pPr>
+        <w:pStyle w:val="Normal"/>
+        <w:rPr/>
+      </w:pPr>
+      <w:r>
+        <w:rPr/>
       </w:r>
     </w:p>
     <w:p>
@@ -3556,10 +3452,15 @@
     <w:p>
       <w:pPr>
         <w:pStyle w:val="Normal"/>
-        <w:rPr/>
-      </w:pPr>
-      <w:r>
-        <w:rPr/>
+        <w:rPr>
+          <w:color w:val="FF6600"/>
+        </w:rPr>
+      </w:pPr>
+      <w:r>
+        <w:rPr>
+          <w:color w:val="FF6600"/>
+        </w:rPr>
+        <w:t>JSJ: Du har helt ret, og alle disse fejl er beskrevet ovenfor</w:t>
       </w:r>
     </w:p>
     <w:p>
@@ -3585,10 +3486,15 @@
     <w:p>
       <w:pPr>
         <w:pStyle w:val="Normal"/>
-        <w:rPr/>
-      </w:pPr>
-      <w:r>
-        <w:rPr/>
+        <w:rPr>
+          <w:color w:val="FF6600"/>
+        </w:rPr>
+      </w:pPr>
+      <w:r>
+        <w:rPr>
+          <w:color w:val="FF6600"/>
+        </w:rPr>
+        <w:t>JSJ: Ja, fejlen stammer fra MusicXml filen</w:t>
       </w:r>
     </w:p>
     <w:p>
@@ -3598,6 +3504,22 @@
       </w:pPr>
       <w:r>
         <w:rPr/>
+      </w:r>
+      <w:r>
+        <w:br w:type="page"/>
+      </w:r>
+    </w:p>
+    <w:p>
+      <w:pPr>
+        <w:pStyle w:val="Overskrift3"/>
+        <w:rPr/>
+      </w:pPr>
+      <w:r>
+        <w:rPr/>
+        <w:t>J</w:t>
+      </w:r>
+      <w:r>
+        <w:rPr/>
         <w:t xml:space="preserve">Filen Maria gennem torne går test 4 xml filen </w:t>
       </w:r>
     </w:p>
@@ -3633,10 +3555,15 @@
     <w:p>
       <w:pPr>
         <w:pStyle w:val="Normal"/>
-        <w:rPr/>
-      </w:pPr>
-      <w:r>
-        <w:rPr/>
+        <w:rPr>
+          <w:color w:val="FF6600"/>
+        </w:rPr>
+      </w:pPr>
+      <w:r>
+        <w:rPr>
+          <w:color w:val="FF6600"/>
+        </w:rPr>
+        <w:t>JSJ: Jeg er ikke sikker på at den korrekte sortering er konsekvent. Det må checkes</w:t>
       </w:r>
     </w:p>
     <w:p>
@@ -3824,10 +3751,44 @@
     <w:p>
       <w:pPr>
         <w:pStyle w:val="Normal"/>
-        <w:rPr/>
-      </w:pPr>
-      <w:r>
-        <w:rPr/>
+        <w:rPr>
+          <w:color w:val="FF6600"/>
+        </w:rPr>
+      </w:pPr>
+      <w:r>
+        <w:rPr>
+          <w:color w:val="FF6600"/>
+        </w:rPr>
+        <w:t>JSJ: Kendte fejl: Forkert placeret skilleterg, manglende oktavtegn, septimfejlen.</w:t>
+      </w:r>
+    </w:p>
+    <w:p>
+      <w:pPr>
+        <w:pStyle w:val="Normal"/>
+        <w:rPr>
+          <w:color w:val="FF6600"/>
+        </w:rPr>
+      </w:pPr>
+      <w:r>
+        <w:rPr>
+          <w:color w:val="FF6600"/>
+        </w:rPr>
+      </w:r>
+      <w:r>
+        <w:br w:type="page"/>
+      </w:r>
+    </w:p>
+    <w:p>
+      <w:pPr>
+        <w:pStyle w:val="Normal"/>
+        <w:rPr>
+          <w:color w:val="FF6600"/>
+        </w:rPr>
+      </w:pPr>
+      <w:r>
+        <w:rPr>
+          <w:color w:val="FF6600"/>
+        </w:rPr>
       </w:r>
     </w:p>
     <w:p>
@@ -3938,10 +3899,15 @@
     <w:p>
       <w:pPr>
         <w:pStyle w:val="Normal"/>
-        <w:rPr/>
-      </w:pPr>
-      <w:r>
-        <w:rPr/>
+        <w:rPr>
+          <w:color w:val="FF6600"/>
+        </w:rPr>
+      </w:pPr>
+      <w:r>
+        <w:rPr>
+          <w:color w:val="FF6600"/>
+        </w:rPr>
+        <w:t>JSJ: tilde er fixet i 3.4</w:t>
       </w:r>
     </w:p>
     <w:p>
@@ -3957,6 +3923,29 @@
     <w:p>
       <w:pPr>
         <w:pStyle w:val="Normal"/>
+        <w:rPr>
+          <w:color w:val="FF6600"/>
+        </w:rPr>
+      </w:pPr>
+      <w:r>
+        <w:rPr>
+          <w:color w:val="FF6600"/>
+        </w:rPr>
+        <w:t xml:space="preserve">JSJ: Jeg må checke hvilke tegn der skal anvendes for  de forskellige nøgler, 'clefs'. </w:t>
+      </w:r>
+    </w:p>
+    <w:p>
+      <w:pPr>
+        <w:pStyle w:val="Normal"/>
+        <w:rPr/>
+      </w:pPr>
+      <w:r>
+        <w:rPr/>
+      </w:r>
+    </w:p>
+    <w:p>
+      <w:pPr>
+        <w:pStyle w:val="Normal"/>
         <w:rPr/>
       </w:pPr>
       <w:r>
@@ -4005,10 +3994,15 @@
     <w:p>
       <w:pPr>
         <w:pStyle w:val="Normal"/>
-        <w:rPr/>
-      </w:pPr>
-      <w:r>
-        <w:rPr/>
+        <w:rPr>
+          <w:color w:val="FF6600"/>
+        </w:rPr>
+      </w:pPr>
+      <w:r>
+        <w:rPr>
+          <w:color w:val="FF6600"/>
+        </w:rPr>
+        <w:t>JSJ: Alt om korrekt deling af linier må vente til Version 5.0</w:t>
       </w:r>
     </w:p>
     <w:p>
@@ -4024,6 +4018,20 @@
     <w:p>
       <w:pPr>
         <w:pStyle w:val="Normal"/>
+        <w:rPr>
+          <w:color w:val="FF6600"/>
+        </w:rPr>
+      </w:pPr>
+      <w:r>
+        <w:rPr>
+          <w:color w:val="FF6600"/>
+        </w:rPr>
+        <w:t>JSJ: Omtalt tidligere.</w:t>
+      </w:r>
+    </w:p>
+    <w:p>
+      <w:pPr>
+        <w:pStyle w:val="Normal"/>
         <w:rPr/>
       </w:pPr>
       <w:r>
@@ -4043,10 +4051,15 @@
     <w:p>
       <w:pPr>
         <w:pStyle w:val="Normal"/>
-        <w:rPr/>
-      </w:pPr>
-      <w:r>
-        <w:rPr/>
+        <w:rPr>
+          <w:color w:val="FF6600"/>
+        </w:rPr>
+      </w:pPr>
+      <w:r>
+        <w:rPr>
+          <w:color w:val="FF6600"/>
+        </w:rPr>
+        <w:t>JSJ: Helt forventet. Prøv at lave 2 forskellige profiler med forskellig linielængde til de to apparater.</w:t>
       </w:r>
     </w:p>
     <w:p>
@@ -4195,10 +4208,15 @@
     <w:p>
       <w:pPr>
         <w:pStyle w:val="Normal"/>
-        <w:rPr/>
-      </w:pPr>
-      <w:r>
-        <w:rPr/>
+        <w:rPr>
+          <w:color w:val="FF6600"/>
+        </w:rPr>
+      </w:pPr>
+      <w:r>
+        <w:rPr>
+          <w:color w:val="FF6600"/>
+        </w:rPr>
+        <w:t>JSJ: Altsammen kendte problemer.</w:t>
       </w:r>
     </w:p>
     <w:p>
@@ -4240,7 +4258,6 @@
       </w:pPr>
       <w:rPr>
         <w:rFonts w:ascii="Symbol" w:hAnsi="Symbol" w:cs="Symbol" w:hint="default"/>
-        <w:rFonts w:cs="Symbol"/>
       </w:rPr>
     </w:lvl>
     <w:lvl w:ilvl="1">
@@ -4253,7 +4270,6 @@
       </w:pPr>
       <w:rPr>
         <w:rFonts w:ascii="Courier New" w:hAnsi="Courier New" w:cs="Courier New" w:hint="default"/>
-        <w:rFonts w:cs="Courier New"/>
       </w:rPr>
     </w:lvl>
     <w:lvl w:ilvl="2">
@@ -4266,7 +4282,6 @@
       </w:pPr>
       <w:rPr>
         <w:rFonts w:ascii="Wingdings" w:hAnsi="Wingdings" w:cs="Wingdings" w:hint="default"/>
-        <w:rFonts w:cs="Wingdings"/>
       </w:rPr>
     </w:lvl>
     <w:lvl w:ilvl="3">
@@ -4279,7 +4294,6 @@
       </w:pPr>
       <w:rPr>
         <w:rFonts w:ascii="Symbol" w:hAnsi="Symbol" w:cs="Symbol" w:hint="default"/>
-        <w:rFonts w:cs="Symbol"/>
       </w:rPr>
     </w:lvl>
     <w:lvl w:ilvl="4">
@@ -4292,7 +4306,6 @@
       </w:pPr>
       <w:rPr>
         <w:rFonts w:ascii="Courier New" w:hAnsi="Courier New" w:cs="Courier New" w:hint="default"/>
-        <w:rFonts w:cs="Courier New"/>
       </w:rPr>
     </w:lvl>
     <w:lvl w:ilvl="5">
@@ -4305,7 +4318,6 @@
       </w:pPr>
       <w:rPr>
         <w:rFonts w:ascii="Wingdings" w:hAnsi="Wingdings" w:cs="Wingdings" w:hint="default"/>
-        <w:rFonts w:cs="Wingdings"/>
       </w:rPr>
     </w:lvl>
     <w:lvl w:ilvl="6">
@@ -4318,7 +4330,6 @@
       </w:pPr>
       <w:rPr>
         <w:rFonts w:ascii="Symbol" w:hAnsi="Symbol" w:cs="Symbol" w:hint="default"/>
-        <w:rFonts w:cs="Symbol"/>
       </w:rPr>
     </w:lvl>
     <w:lvl w:ilvl="7">
@@ -4331,7 +4342,6 @@
       </w:pPr>
       <w:rPr>
         <w:rFonts w:ascii="Courier New" w:hAnsi="Courier New" w:cs="Courier New" w:hint="default"/>
-        <w:rFonts w:cs="Courier New"/>
       </w:rPr>
     </w:lvl>
     <w:lvl w:ilvl="8">
@@ -4344,99 +4354,125 @@
       </w:pPr>
       <w:rPr>
         <w:rFonts w:ascii="Wingdings" w:hAnsi="Wingdings" w:cs="Wingdings" w:hint="default"/>
-        <w:rFonts w:cs="Wingdings"/>
       </w:rPr>
     </w:lvl>
   </w:abstractNum>
   <w:abstractNum w:abstractNumId="2">
     <w:lvl w:ilvl="0">
       <w:start w:val="1"/>
-      <w:numFmt w:val="none"/>
+      <w:numFmt w:val="decimal"/>
       <w:suff w:val="nothing"/>
       <w:lvlText w:val=""/>
       <w:lvlJc w:val="left"/>
       <w:pPr>
-        <w:ind w:left="0" w:hanging="0"/>
+        <w:tabs>
+          <w:tab w:val="num" w:pos="432"/>
+        </w:tabs>
+        <w:ind w:left="432" w:hanging="432"/>
       </w:pPr>
     </w:lvl>
     <w:lvl w:ilvl="1">
       <w:start w:val="1"/>
-      <w:numFmt w:val="none"/>
+      <w:numFmt w:val="decimal"/>
       <w:suff w:val="nothing"/>
       <w:lvlText w:val=""/>
       <w:lvlJc w:val="left"/>
       <w:pPr>
-        <w:ind w:left="0" w:hanging="0"/>
+        <w:tabs>
+          <w:tab w:val="num" w:pos="576"/>
+        </w:tabs>
+        <w:ind w:left="576" w:hanging="576"/>
       </w:pPr>
     </w:lvl>
     <w:lvl w:ilvl="2">
       <w:start w:val="1"/>
-      <w:numFmt w:val="none"/>
+      <w:numFmt w:val="decimal"/>
       <w:suff w:val="nothing"/>
       <w:lvlText w:val=""/>
       <w:lvlJc w:val="left"/>
       <w:pPr>
-        <w:ind w:left="0" w:hanging="0"/>
+        <w:tabs>
+          <w:tab w:val="num" w:pos="720"/>
+        </w:tabs>
+        <w:ind w:left="720" w:hanging="720"/>
       </w:pPr>
     </w:lvl>
     <w:lvl w:ilvl="3">
       <w:start w:val="1"/>
-      <w:numFmt w:val="none"/>
+      <w:numFmt w:val="decimal"/>
       <w:suff w:val="nothing"/>
       <w:lvlText w:val=""/>
       <w:lvlJc w:val="left"/>
       <w:pPr>
-        <w:ind w:left="0" w:hanging="0"/>
+        <w:tabs>
+          <w:tab w:val="num" w:pos="864"/>
+        </w:tabs>
+        <w:ind w:left="864" w:hanging="864"/>
       </w:pPr>
     </w:lvl>
     <w:lvl w:ilvl="4">
       <w:start w:val="1"/>
-      <w:numFmt w:val="none"/>
+      <w:numFmt w:val="decimal"/>
       <w:suff w:val="nothing"/>
       <w:lvlText w:val=""/>
       <w:lvlJc w:val="left"/>
       <w:pPr>
-        <w:ind w:left="0" w:hanging="0"/>
+        <w:tabs>
+          <w:tab w:val="num" w:pos="1008"/>
+        </w:tabs>
+        <w:ind w:left="1008" w:hanging="1008"/>
       </w:pPr>
     </w:lvl>
     <w:lvl w:ilvl="5">
       <w:start w:val="1"/>
-      <w:numFmt w:val="none"/>
+      <w:numFmt w:val="decimal"/>
       <w:suff w:val="nothing"/>
       <w:lvlText w:val=""/>
       <w:lvlJc w:val="left"/>
       <w:pPr>
-        <w:ind w:left="0" w:hanging="0"/>
+        <w:tabs>
+          <w:tab w:val="num" w:pos="1152"/>
+        </w:tabs>
+        <w:ind w:left="1152" w:hanging="1152"/>
       </w:pPr>
     </w:lvl>
     <w:lvl w:ilvl="6">
       <w:start w:val="1"/>
-      <w:numFmt w:val="none"/>
+      <w:numFmt w:val="decimal"/>
       <w:suff w:val="nothing"/>
       <w:lvlText w:val=""/>
       <w:lvlJc w:val="left"/>
       <w:pPr>
-        <w:ind w:left="0" w:hanging="0"/>
+        <w:tabs>
+          <w:tab w:val="num" w:pos="1296"/>
+        </w:tabs>
+        <w:ind w:left="1296" w:hanging="1296"/>
       </w:pPr>
     </w:lvl>
     <w:lvl w:ilvl="7">
       <w:start w:val="1"/>
-      <w:numFmt w:val="none"/>
+      <w:numFmt w:val="decimal"/>
       <w:suff w:val="nothing"/>
       <w:lvlText w:val=""/>
       <w:lvlJc w:val="left"/>
       <w:pPr>
-        <w:ind w:left="0" w:hanging="0"/>
+        <w:tabs>
+          <w:tab w:val="num" w:pos="1440"/>
+        </w:tabs>
+        <w:ind w:left="1440" w:hanging="1440"/>
       </w:pPr>
     </w:lvl>
     <w:lvl w:ilvl="8">
       <w:start w:val="1"/>
-      <w:numFmt w:val="none"/>
+      <w:numFmt w:val="decimal"/>
       <w:suff w:val="nothing"/>
       <w:lvlText w:val=""/>
       <w:lvlJc w:val="left"/>
       <w:pPr>
-        <w:ind w:left="0" w:hanging="0"/>
+        <w:tabs>
+          <w:tab w:val="num" w:pos="1584"/>
+        </w:tabs>
+        <w:ind w:left="1584" w:hanging="1584"/>
       </w:pPr>
     </w:lvl>
   </w:abstractNum>
@@ -4855,7 +4891,7 @@
     </w:rPr>
   </w:style>
   <w:style w:type="paragraph" w:styleId="Overskrift1">
-    <w:name w:val="Heading 1"/>
+    <w:name w:val="Overskrift 1"/>
     <w:basedOn w:val="Normal"/>
     <w:next w:val="Normal"/>
     <w:link w:val="Overskrift1Tegn"/>
@@ -4876,7 +4912,7 @@
     </w:rPr>
   </w:style>
   <w:style w:type="paragraph" w:styleId="Overskrift2">
-    <w:name w:val="Heading 2"/>
+    <w:name w:val="Overskrift 2"/>
     <w:basedOn w:val="Normal"/>
     <w:next w:val="Normal"/>
     <w:link w:val="Overskrift2Tegn"/>
@@ -4898,7 +4934,7 @@
     </w:rPr>
   </w:style>
   <w:style w:type="paragraph" w:styleId="Overskrift3">
-    <w:name w:val="Heading 3"/>
+    <w:name w:val="Overskrift 3"/>
     <w:basedOn w:val="Normal"/>
     <w:next w:val="Normal"/>
     <w:link w:val="Overskrift3Tegn"/>
@@ -5389,6 +5425,27 @@
       <w:rFonts w:cs="Wingdings"/>
     </w:rPr>
   </w:style>
+  <w:style w:type="character" w:styleId="ListLabel61">
+    <w:name w:val="ListLabel 61"/>
+    <w:qFormat/>
+    <w:rPr>
+      <w:rFonts w:cs="Symbol"/>
+    </w:rPr>
+  </w:style>
+  <w:style w:type="character" w:styleId="ListLabel62">
+    <w:name w:val="ListLabel 62"/>
+    <w:qFormat/>
+    <w:rPr>
+      <w:rFonts w:cs="Courier New"/>
+    </w:rPr>
+  </w:style>
+  <w:style w:type="character" w:styleId="ListLabel63">
+    <w:name w:val="ListLabel 63"/>
+    <w:qFormat/>
+    <w:rPr>
+      <w:rFonts w:cs="Wingdings"/>
+    </w:rPr>
+  </w:style>
   <w:style w:type="paragraph" w:styleId="Overskrift">
     <w:name w:val="Overskrift"/>
     <w:basedOn w:val="Normal"/>
@@ -5405,7 +5462,7 @@
     </w:rPr>
   </w:style>
   <w:style w:type="paragraph" w:styleId="Brdtekst">
-    <w:name w:val="Body Text"/>
+    <w:name w:val="Brødtekst"/>
     <w:basedOn w:val="Normal"/>
     <w:pPr>
       <w:spacing w:lineRule="auto" w:line="288" w:before="0" w:after="140"/>
@@ -5413,7 +5470,7 @@
     <w:rPr/>
   </w:style>
   <w:style w:type="paragraph" w:styleId="Liste">
-    <w:name w:val="List"/>
+    <w:name w:val="Liste"/>
     <w:basedOn w:val="Brdtekst"/>
     <w:pPr/>
     <w:rPr>
@@ -5421,7 +5478,7 @@
     </w:rPr>
   </w:style>
   <w:style w:type="paragraph" w:styleId="Billedtekst">
-    <w:name w:val="Caption"/>
+    <w:name w:val="Billedtekst"/>
     <w:basedOn w:val="Normal"/>
     <w:qFormat/>
     <w:pPr>

</xml_diff>